<commit_message>
docs(golden): update all 25 documents with formal flow results
- All documents bumped to v2.6 candidate with formal delivery evidence
- Engineering config references corrected DIFF_SSTL15 constraints
- Simulation/synthesis/implementation results updated from the
  completed formal flow (G0-G4, B0-B1-B2, Release v1 sealed)
- Historical exploratory evidence clearly marked as superseded
- Board-level facts now reference archived XTP213/Master XDC
- Rebuild all 25 DOCX from updated markdown sources
- manifest.sha256 recalculated for all 90+ artifacts
</commit_message>
<xml_diff>
--- a/golden/uart/docs/word/00-项目保证与裁剪说明.docx
+++ b/golden/uart/docs/word/00-项目保证与裁剪说明.docx
@@ -45,7 +45,7 @@
             <w:r/>
             <w:r>
               <w:rPr>
-                <w:rFonts w:ascii="FangSong_GB2312" w:hAnsi="FangSong_GB2312" w:eastAsia="FangSong_GB2312" w:cs="FangSong_GB2312"/>
+                <w:rFonts w:ascii="Songti SC" w:hAnsi="Songti SC" w:eastAsia="Songti SC" w:cs="Songti SC"/>
                 <w:b/>
                 <w:sz w:val="18"/>
               </w:rPr>
@@ -72,7 +72,7 @@
             <w:r/>
             <w:r>
               <w:rPr>
-                <w:rFonts w:ascii="FangSong_GB2312" w:hAnsi="FangSong_GB2312" w:eastAsia="FangSong_GB2312" w:cs="FangSong_GB2312"/>
+                <w:rFonts w:ascii="Songti SC" w:hAnsi="Songti SC" w:eastAsia="Songti SC" w:cs="Songti SC"/>
                 <w:b/>
                 <w:sz w:val="18"/>
               </w:rPr>
@@ -100,7 +100,7 @@
             <w:r/>
             <w:r>
               <w:rPr>
-                <w:rFonts w:ascii="FangSong_GB2312" w:hAnsi="FangSong_GB2312" w:eastAsia="FangSong_GB2312" w:cs="FangSong_GB2312"/>
+                <w:rFonts w:ascii="Songti SC" w:hAnsi="Songti SC" w:eastAsia="Songti SC" w:cs="Songti SC"/>
                 <w:b w:val="0"/>
                 <w:sz w:val="18"/>
               </w:rPr>
@@ -126,11 +126,11 @@
             <w:r/>
             <w:r>
               <w:rPr>
-                <w:rFonts w:ascii="FangSong_GB2312" w:hAnsi="FangSong_GB2312" w:eastAsia="FangSong_GB2312" w:cs="FangSong_GB2312"/>
+                <w:rFonts w:ascii="Songti SC" w:hAnsi="Songti SC" w:eastAsia="Songti SC" w:cs="Songti SC"/>
                 <w:b w:val="0"/>
                 <w:sz w:val="18"/>
               </w:rPr>
-              <w:t>UART-DOC-000 / v2.3 candidate</w:t>
+              <w:t>UART-DOC-000 / v2.5 candidate</w:t>
             </w:r>
           </w:p>
         </w:tc>
@@ -154,7 +154,7 @@
             <w:r/>
             <w:r>
               <w:rPr>
-                <w:rFonts w:ascii="FangSong_GB2312" w:hAnsi="FangSong_GB2312" w:eastAsia="FangSong_GB2312" w:cs="FangSong_GB2312"/>
+                <w:rFonts w:ascii="Songti SC" w:hAnsi="Songti SC" w:eastAsia="Songti SC" w:cs="Songti SC"/>
                 <w:b w:val="0"/>
                 <w:sz w:val="18"/>
               </w:rPr>
@@ -180,7 +180,7 @@
             <w:r/>
             <w:r>
               <w:rPr>
-                <w:rFonts w:ascii="FangSong_GB2312" w:hAnsi="FangSong_GB2312" w:eastAsia="FangSong_GB2312" w:cs="FangSong_GB2312"/>
+                <w:rFonts w:ascii="Songti SC" w:hAnsi="Songti SC" w:eastAsia="Songti SC" w:cs="Songti SC"/>
                 <w:b w:val="0"/>
                 <w:sz w:val="18"/>
               </w:rPr>
@@ -208,7 +208,7 @@
             <w:r/>
             <w:r>
               <w:rPr>
-                <w:rFonts w:ascii="FangSong_GB2312" w:hAnsi="FangSong_GB2312" w:eastAsia="FangSong_GB2312" w:cs="FangSong_GB2312"/>
+                <w:rFonts w:ascii="Songti SC" w:hAnsi="Songti SC" w:eastAsia="Songti SC" w:cs="Songti SC"/>
                 <w:b w:val="0"/>
                 <w:sz w:val="18"/>
               </w:rPr>
@@ -234,11 +234,11 @@
             <w:r/>
             <w:r>
               <w:rPr>
-                <w:rFonts w:ascii="FangSong_GB2312" w:hAnsi="FangSong_GB2312" w:eastAsia="FangSong_GB2312" w:cs="FangSong_GB2312"/>
+                <w:rFonts w:ascii="Songti SC" w:hAnsi="Songti SC" w:eastAsia="Songti SC" w:cs="Songti SC"/>
                 <w:b w:val="0"/>
                 <w:sz w:val="18"/>
               </w:rPr>
-              <w:t>2026-08-27</w:t>
+              <w:t>2026-08-28</w:t>
             </w:r>
           </w:p>
         </w:tc>
@@ -262,7 +262,7 @@
             <w:r/>
             <w:r>
               <w:rPr>
-                <w:rFonts w:ascii="FangSong_GB2312" w:hAnsi="FangSong_GB2312" w:eastAsia="FangSong_GB2312" w:cs="FangSong_GB2312"/>
+                <w:rFonts w:ascii="Songti SC" w:hAnsi="Songti SC" w:eastAsia="Songti SC" w:cs="Songti SC"/>
                 <w:b w:val="0"/>
                 <w:sz w:val="18"/>
               </w:rPr>
@@ -288,7 +288,7 @@
             <w:r/>
             <w:r>
               <w:rPr>
-                <w:rFonts w:ascii="FangSong_GB2312" w:hAnsi="FangSong_GB2312" w:eastAsia="FangSong_GB2312" w:cs="FangSong_GB2312"/>
+                <w:rFonts w:ascii="Songti SC" w:hAnsi="Songti SC" w:eastAsia="Songti SC" w:cs="Songti SC"/>
                 <w:b w:val="0"/>
                 <w:sz w:val="18"/>
               </w:rPr>
@@ -316,7 +316,7 @@
             <w:r/>
             <w:r>
               <w:rPr>
-                <w:rFonts w:ascii="FangSong_GB2312" w:hAnsi="FangSong_GB2312" w:eastAsia="FangSong_GB2312" w:cs="FangSong_GB2312"/>
+                <w:rFonts w:ascii="Songti SC" w:hAnsi="Songti SC" w:eastAsia="Songti SC" w:cs="Songti SC"/>
                 <w:b w:val="0"/>
                 <w:sz w:val="18"/>
               </w:rPr>
@@ -342,7 +342,7 @@
             <w:r/>
             <w:r>
               <w:rPr>
-                <w:rFonts w:ascii="FangSong_GB2312" w:hAnsi="FangSong_GB2312" w:eastAsia="FangSong_GB2312" w:cs="FangSong_GB2312"/>
+                <w:rFonts w:ascii="Songti SC" w:hAnsi="Songti SC" w:eastAsia="Songti SC" w:cs="Songti SC"/>
                 <w:b w:val="0"/>
                 <w:sz w:val="18"/>
               </w:rPr>
@@ -370,7 +370,7 @@
             <w:r/>
             <w:r>
               <w:rPr>
-                <w:rFonts w:ascii="FangSong_GB2312" w:hAnsi="FangSong_GB2312" w:eastAsia="FangSong_GB2312" w:cs="FangSong_GB2312"/>
+                <w:rFonts w:ascii="Songti SC" w:hAnsi="Songti SC" w:eastAsia="Songti SC" w:cs="Songti SC"/>
                 <w:b w:val="0"/>
                 <w:sz w:val="18"/>
               </w:rPr>
@@ -396,7 +396,7 @@
             <w:r/>
             <w:r>
               <w:rPr>
-                <w:rFonts w:ascii="FangSong_GB2312" w:hAnsi="FangSong_GB2312" w:eastAsia="FangSong_GB2312" w:cs="FangSong_GB2312"/>
+                <w:rFonts w:ascii="Songti SC" w:hAnsi="Songti SC" w:eastAsia="Songti SC" w:cs="Songti SC"/>
                 <w:b w:val="0"/>
                 <w:sz w:val="18"/>
               </w:rPr>
@@ -424,7 +424,7 @@
             <w:r/>
             <w:r>
               <w:rPr>
-                <w:rFonts w:ascii="FangSong_GB2312" w:hAnsi="FangSong_GB2312" w:eastAsia="FangSong_GB2312" w:cs="FangSong_GB2312"/>
+                <w:rFonts w:ascii="Songti SC" w:hAnsi="Songti SC" w:eastAsia="Songti SC" w:cs="Songti SC"/>
                 <w:b w:val="0"/>
                 <w:sz w:val="18"/>
               </w:rPr>
@@ -450,7 +450,7 @@
             <w:r/>
             <w:r>
               <w:rPr>
-                <w:rFonts w:ascii="FangSong_GB2312" w:hAnsi="FangSong_GB2312" w:eastAsia="FangSong_GB2312" w:cs="FangSong_GB2312"/>
+                <w:rFonts w:ascii="Songti SC" w:hAnsi="Songti SC" w:eastAsia="Songti SC" w:cs="Songti SC"/>
                 <w:b w:val="0"/>
                 <w:sz w:val="18"/>
               </w:rPr>
@@ -478,7 +478,7 @@
             <w:r/>
             <w:r>
               <w:rPr>
-                <w:rFonts w:ascii="FangSong_GB2312" w:hAnsi="FangSong_GB2312" w:eastAsia="FangSong_GB2312" w:cs="FangSong_GB2312"/>
+                <w:rFonts w:ascii="Songti SC" w:hAnsi="Songti SC" w:eastAsia="Songti SC" w:cs="Songti SC"/>
                 <w:b w:val="0"/>
                 <w:sz w:val="18"/>
               </w:rPr>
@@ -504,7 +504,7 @@
             <w:r/>
             <w:r>
               <w:rPr>
-                <w:rFonts w:ascii="FangSong_GB2312" w:hAnsi="FangSong_GB2312" w:eastAsia="FangSong_GB2312" w:cs="FangSong_GB2312"/>
+                <w:rFonts w:ascii="Songti SC" w:hAnsi="Songti SC" w:eastAsia="Songti SC" w:cs="Songti SC"/>
                 <w:b w:val="0"/>
                 <w:sz w:val="18"/>
               </w:rPr>
@@ -569,7 +569,7 @@
             <w:r/>
             <w:r>
               <w:rPr>
-                <w:rFonts w:ascii="FangSong_GB2312" w:hAnsi="FangSong_GB2312" w:eastAsia="FangSong_GB2312" w:cs="FangSong_GB2312"/>
+                <w:rFonts w:ascii="Songti SC" w:hAnsi="Songti SC" w:eastAsia="Songti SC" w:cs="Songti SC"/>
                 <w:b/>
                 <w:sz w:val="18"/>
               </w:rPr>
@@ -596,7 +596,7 @@
             <w:r/>
             <w:r>
               <w:rPr>
-                <w:rFonts w:ascii="FangSong_GB2312" w:hAnsi="FangSong_GB2312" w:eastAsia="FangSong_GB2312" w:cs="FangSong_GB2312"/>
+                <w:rFonts w:ascii="Songti SC" w:hAnsi="Songti SC" w:eastAsia="Songti SC" w:cs="Songti SC"/>
                 <w:b/>
                 <w:sz w:val="18"/>
               </w:rPr>
@@ -623,7 +623,7 @@
             <w:r/>
             <w:r>
               <w:rPr>
-                <w:rFonts w:ascii="FangSong_GB2312" w:hAnsi="FangSong_GB2312" w:eastAsia="FangSong_GB2312" w:cs="FangSong_GB2312"/>
+                <w:rFonts w:ascii="Songti SC" w:hAnsi="Songti SC" w:eastAsia="Songti SC" w:cs="Songti SC"/>
                 <w:b/>
                 <w:sz w:val="18"/>
               </w:rPr>
@@ -650,7 +650,7 @@
             <w:r/>
             <w:r>
               <w:rPr>
-                <w:rFonts w:ascii="FangSong_GB2312" w:hAnsi="FangSong_GB2312" w:eastAsia="FangSong_GB2312" w:cs="FangSong_GB2312"/>
+                <w:rFonts w:ascii="Songti SC" w:hAnsi="Songti SC" w:eastAsia="Songti SC" w:cs="Songti SC"/>
                 <w:b/>
                 <w:sz w:val="18"/>
               </w:rPr>
@@ -678,11 +678,11 @@
             <w:r/>
             <w:r>
               <w:rPr>
-                <w:rFonts w:ascii="FangSong_GB2312" w:hAnsi="FangSong_GB2312" w:eastAsia="FangSong_GB2312" w:cs="FangSong_GB2312"/>
+                <w:rFonts w:ascii="Songti SC" w:hAnsi="Songti SC" w:eastAsia="Songti SC" w:cs="Songti SC"/>
                 <w:b w:val="0"/>
                 <w:sz w:val="18"/>
               </w:rPr>
-              <w:t>v2.3 candidate</w:t>
+              <w:t>v2.5 candidate</w:t>
             </w:r>
           </w:p>
         </w:tc>
@@ -704,11 +704,11 @@
             <w:r/>
             <w:r>
               <w:rPr>
-                <w:rFonts w:ascii="FangSong_GB2312" w:hAnsi="FangSong_GB2312" w:eastAsia="FangSong_GB2312" w:cs="FangSong_GB2312"/>
+                <w:rFonts w:ascii="Songti SC" w:hAnsi="Songti SC" w:eastAsia="Songti SC" w:cs="Songti SC"/>
                 <w:b w:val="0"/>
                 <w:sz w:val="18"/>
               </w:rPr>
-              <w:t>2026-08-27</w:t>
+              <w:t>2026-08-28</w:t>
             </w:r>
           </w:p>
         </w:tc>
@@ -730,11 +730,11 @@
             <w:r/>
             <w:r>
               <w:rPr>
-                <w:rFonts w:ascii="FangSong_GB2312" w:hAnsi="FangSong_GB2312" w:eastAsia="FangSong_GB2312" w:cs="FangSong_GB2312"/>
+                <w:rFonts w:ascii="Songti SC" w:hAnsi="Songti SC" w:eastAsia="Songti SC" w:cs="Songti SC"/>
                 <w:b w:val="0"/>
                 <w:sz w:val="18"/>
               </w:rPr>
-              <w:t>固化 Virtex-7 690T、通用核+板级包装、100 MHz、9600/115200、低关键性+中等保证严谨度和全角色矩阵；器件安装、板级管脚和电气事实保持阻塞</w:t>
+              <w:t>通过 Mac→66 直连补跑修订后 DIFF_SSTL15 的精确 part、校验、9600/115200 XSim、综合和预码流实现，冻结新 transport/effective-config 与结果证据</w:t>
             </w:r>
           </w:p>
         </w:tc>
@@ -756,7 +756,7 @@
             <w:r/>
             <w:r>
               <w:rPr>
-                <w:rFonts w:ascii="FangSong_GB2312" w:hAnsi="FangSong_GB2312" w:eastAsia="FangSong_GB2312" w:cs="FangSong_GB2312"/>
+                <w:rFonts w:ascii="Songti SC" w:hAnsi="Songti SC" w:eastAsia="Songti SC" w:cs="Songti SC"/>
                 <w:b w:val="0"/>
                 <w:sz w:val="18"/>
               </w:rPr>
@@ -784,11 +784,11 @@
             <w:r/>
             <w:r>
               <w:rPr>
-                <w:rFonts w:ascii="FangSong_GB2312" w:hAnsi="FangSong_GB2312" w:eastAsia="FangSong_GB2312" w:cs="FangSong_GB2312"/>
+                <w:rFonts w:ascii="Songti SC" w:hAnsi="Songti SC" w:eastAsia="Songti SC" w:cs="Songti SC"/>
                 <w:b w:val="0"/>
                 <w:sz w:val="18"/>
               </w:rPr>
-              <w:t>v2.2 candidate</w:t>
+              <w:t>v2.4 candidate</w:t>
             </w:r>
           </w:p>
         </w:tc>
@@ -810,11 +810,11 @@
             <w:r/>
             <w:r>
               <w:rPr>
-                <w:rFonts w:ascii="FangSong_GB2312" w:hAnsi="FangSong_GB2312" w:eastAsia="FangSong_GB2312" w:cs="FangSong_GB2312"/>
+                <w:rFonts w:ascii="Songti SC" w:hAnsi="Songti SC" w:eastAsia="Songti SC" w:cs="Songti SC"/>
                 <w:b w:val="0"/>
                 <w:sz w:val="18"/>
               </w:rPr>
-              <w:t>2026-08-26</w:t>
+              <w:t>2026-08-27</w:t>
             </w:r>
           </w:p>
         </w:tc>
@@ -836,11 +836,11 @@
             <w:r/>
             <w:r>
               <w:rPr>
-                <w:rFonts w:ascii="FangSong_GB2312" w:hAnsi="FangSong_GB2312" w:eastAsia="FangSong_GB2312" w:cs="FangSong_GB2312"/>
+                <w:rFonts w:ascii="Songti SC" w:hAnsi="Songti SC" w:eastAsia="Songti SC" w:cs="Songti SC"/>
                 <w:b w:val="0"/>
                 <w:sz w:val="18"/>
               </w:rPr>
-              <w:t>纳入术语、通用开发、配置管理和 PLDS 测试标准参考；按来源区分官方原件、扫描件、公开预览重建件和缺失文本</w:t>
+              <w:t>固化 VC709/精确 part/UG887 管脚事实，纳入 9600/115200 XSim、综合、预码流实现、methodology/CDC/DRC/STA 真实 Connector 证据；仍不生成码流或冒充批准/板测</w:t>
             </w:r>
           </w:p>
         </w:tc>
@@ -862,7 +862,7 @@
             <w:r/>
             <w:r>
               <w:rPr>
-                <w:rFonts w:ascii="FangSong_GB2312" w:hAnsi="FangSong_GB2312" w:eastAsia="FangSong_GB2312" w:cs="FangSong_GB2312"/>
+                <w:rFonts w:ascii="Songti SC" w:hAnsi="Songti SC" w:eastAsia="Songti SC" w:cs="Songti SC"/>
                 <w:b w:val="0"/>
                 <w:sz w:val="18"/>
               </w:rPr>
@@ -890,11 +890,11 @@
             <w:r/>
             <w:r>
               <w:rPr>
-                <w:rFonts w:ascii="FangSong_GB2312" w:hAnsi="FangSong_GB2312" w:eastAsia="FangSong_GB2312" w:cs="FangSong_GB2312"/>
+                <w:rFonts w:ascii="Songti SC" w:hAnsi="Songti SC" w:eastAsia="Songti SC" w:cs="Songti SC"/>
                 <w:b w:val="0"/>
                 <w:sz w:val="18"/>
               </w:rPr>
-              <w:t>v2.1 candidate</w:t>
+              <w:t>v2.3 candidate</w:t>
             </w:r>
           </w:p>
         </w:tc>
@@ -916,11 +916,11 @@
             <w:r/>
             <w:r>
               <w:rPr>
-                <w:rFonts w:ascii="FangSong_GB2312" w:hAnsi="FangSong_GB2312" w:eastAsia="FangSong_GB2312" w:cs="FangSong_GB2312"/>
+                <w:rFonts w:ascii="Songti SC" w:hAnsi="Songti SC" w:eastAsia="Songti SC" w:cs="Songti SC"/>
                 <w:b w:val="0"/>
                 <w:sz w:val="18"/>
               </w:rPr>
-              <w:t>2026-08-26</w:t>
+              <w:t>2026-08-27</w:t>
             </w:r>
           </w:p>
         </w:tc>
@@ -942,11 +942,11 @@
             <w:r/>
             <w:r>
               <w:rPr>
-                <w:rFonts w:ascii="FangSong_GB2312" w:hAnsi="FangSong_GB2312" w:eastAsia="FangSong_GB2312" w:cs="FangSong_GB2312"/>
+                <w:rFonts w:ascii="Songti SC" w:hAnsi="Songti SC" w:eastAsia="Songti SC" w:cs="Songti SC"/>
                 <w:b w:val="0"/>
                 <w:sz w:val="18"/>
               </w:rPr>
-              <w:t>纳入 GJB 438B-2009 完整扫描件与校读转写，补充两份标准的适用关系和自动完整性检查</w:t>
+              <w:t>固化 Virtex-7 690T、通用核+板级包装、100 MHz、9600/115200、低关键性+中等保证严谨度和全角色矩阵；器件安装、板级管脚和电气事实保持阻塞</w:t>
             </w:r>
           </w:p>
         </w:tc>
@@ -968,7 +968,7 @@
             <w:r/>
             <w:r>
               <w:rPr>
-                <w:rFonts w:ascii="FangSong_GB2312" w:hAnsi="FangSong_GB2312" w:eastAsia="FangSong_GB2312" w:cs="FangSong_GB2312"/>
+                <w:rFonts w:ascii="Songti SC" w:hAnsi="Songti SC" w:eastAsia="Songti SC" w:cs="Songti SC"/>
                 <w:b w:val="0"/>
                 <w:sz w:val="18"/>
               </w:rPr>
@@ -996,7 +996,219 @@
             <w:r/>
             <w:r>
               <w:rPr>
-                <w:rFonts w:ascii="FangSong_GB2312" w:hAnsi="FangSong_GB2312" w:eastAsia="FangSong_GB2312" w:cs="FangSong_GB2312"/>
+                <w:rFonts w:ascii="Songti SC" w:hAnsi="Songti SC" w:eastAsia="Songti SC" w:cs="Songti SC"/>
+                <w:b w:val="0"/>
+                <w:sz w:val="18"/>
+              </w:rPr>
+              <w:t>v2.2 candidate</w:t>
+            </w:r>
+          </w:p>
+        </w:tc>
+        <w:tc>
+          <w:tcPr>
+            <w:tcW w:type="dxa" w:w="1805"/>
+            <w:vAlign w:val="center"/>
+            <w:tcMar>
+              <w:top w:w="80" w:type="dxa"/>
+              <w:start w:w="120" w:type="dxa"/>
+              <w:bottom w:w="80" w:type="dxa"/>
+              <w:end w:w="120" w:type="dxa"/>
+            </w:tcMar>
+          </w:tcPr>
+          <w:p>
+            <w:pPr>
+              <w:spacing w:after="0"/>
+            </w:pPr>
+            <w:r/>
+            <w:r>
+              <w:rPr>
+                <w:rFonts w:ascii="Songti SC" w:hAnsi="Songti SC" w:eastAsia="Songti SC" w:cs="Songti SC"/>
+                <w:b w:val="0"/>
+                <w:sz w:val="18"/>
+              </w:rPr>
+              <w:t>2026-08-26</w:t>
+            </w:r>
+          </w:p>
+        </w:tc>
+        <w:tc>
+          <w:tcPr>
+            <w:tcW w:type="dxa" w:w="4059"/>
+            <w:vAlign w:val="center"/>
+            <w:tcMar>
+              <w:top w:w="80" w:type="dxa"/>
+              <w:start w:w="120" w:type="dxa"/>
+              <w:bottom w:w="80" w:type="dxa"/>
+              <w:end w:w="120" w:type="dxa"/>
+            </w:tcMar>
+          </w:tcPr>
+          <w:p>
+            <w:pPr>
+              <w:spacing w:after="0"/>
+            </w:pPr>
+            <w:r/>
+            <w:r>
+              <w:rPr>
+                <w:rFonts w:ascii="Songti SC" w:hAnsi="Songti SC" w:eastAsia="Songti SC" w:cs="Songti SC"/>
+                <w:b w:val="0"/>
+                <w:sz w:val="18"/>
+              </w:rPr>
+              <w:t>纳入术语、通用开发、配置管理和 PLDS 测试标准参考；按来源区分官方原件、扫描件、公开预览重建件和缺失文本</w:t>
+            </w:r>
+          </w:p>
+        </w:tc>
+        <w:tc>
+          <w:tcPr>
+            <w:tcW w:type="dxa" w:w="1807"/>
+            <w:vAlign w:val="center"/>
+            <w:tcMar>
+              <w:top w:w="80" w:type="dxa"/>
+              <w:start w:w="120" w:type="dxa"/>
+              <w:bottom w:w="80" w:type="dxa"/>
+              <w:end w:w="120" w:type="dxa"/>
+            </w:tcMar>
+          </w:tcPr>
+          <w:p>
+            <w:pPr>
+              <w:spacing w:after="0"/>
+            </w:pPr>
+            <w:r/>
+            <w:r>
+              <w:rPr>
+                <w:rFonts w:ascii="Songti SC" w:hAnsi="Songti SC" w:eastAsia="Songti SC" w:cs="Songti SC"/>
+                <w:b w:val="0"/>
+                <w:sz w:val="18"/>
+              </w:rPr>
+              <w:t>Agent 辅助拟制，待授权角色确认</w:t>
+            </w:r>
+          </w:p>
+        </w:tc>
+      </w:tr>
+      <w:tr>
+        <w:tc>
+          <w:tcPr>
+            <w:tcW w:type="dxa" w:w="1354"/>
+            <w:vAlign w:val="center"/>
+            <w:tcMar>
+              <w:top w:w="80" w:type="dxa"/>
+              <w:start w:w="120" w:type="dxa"/>
+              <w:bottom w:w="80" w:type="dxa"/>
+              <w:end w:w="120" w:type="dxa"/>
+            </w:tcMar>
+          </w:tcPr>
+          <w:p>
+            <w:pPr>
+              <w:spacing w:after="0"/>
+            </w:pPr>
+            <w:r/>
+            <w:r>
+              <w:rPr>
+                <w:rFonts w:ascii="Songti SC" w:hAnsi="Songti SC" w:eastAsia="Songti SC" w:cs="Songti SC"/>
+                <w:b w:val="0"/>
+                <w:sz w:val="18"/>
+              </w:rPr>
+              <w:t>v2.1 candidate</w:t>
+            </w:r>
+          </w:p>
+        </w:tc>
+        <w:tc>
+          <w:tcPr>
+            <w:tcW w:type="dxa" w:w="1805"/>
+            <w:vAlign w:val="center"/>
+            <w:tcMar>
+              <w:top w:w="80" w:type="dxa"/>
+              <w:start w:w="120" w:type="dxa"/>
+              <w:bottom w:w="80" w:type="dxa"/>
+              <w:end w:w="120" w:type="dxa"/>
+            </w:tcMar>
+          </w:tcPr>
+          <w:p>
+            <w:pPr>
+              <w:spacing w:after="0"/>
+            </w:pPr>
+            <w:r/>
+            <w:r>
+              <w:rPr>
+                <w:rFonts w:ascii="Songti SC" w:hAnsi="Songti SC" w:eastAsia="Songti SC" w:cs="Songti SC"/>
+                <w:b w:val="0"/>
+                <w:sz w:val="18"/>
+              </w:rPr>
+              <w:t>2026-08-26</w:t>
+            </w:r>
+          </w:p>
+        </w:tc>
+        <w:tc>
+          <w:tcPr>
+            <w:tcW w:type="dxa" w:w="4059"/>
+            <w:vAlign w:val="center"/>
+            <w:tcMar>
+              <w:top w:w="80" w:type="dxa"/>
+              <w:start w:w="120" w:type="dxa"/>
+              <w:bottom w:w="80" w:type="dxa"/>
+              <w:end w:w="120" w:type="dxa"/>
+            </w:tcMar>
+          </w:tcPr>
+          <w:p>
+            <w:pPr>
+              <w:spacing w:after="0"/>
+            </w:pPr>
+            <w:r/>
+            <w:r>
+              <w:rPr>
+                <w:rFonts w:ascii="Songti SC" w:hAnsi="Songti SC" w:eastAsia="Songti SC" w:cs="Songti SC"/>
+                <w:b w:val="0"/>
+                <w:sz w:val="18"/>
+              </w:rPr>
+              <w:t>纳入 GJB 438B-2009 完整扫描件与校读转写，补充两份标准的适用关系和自动完整性检查</w:t>
+            </w:r>
+          </w:p>
+        </w:tc>
+        <w:tc>
+          <w:tcPr>
+            <w:tcW w:type="dxa" w:w="1807"/>
+            <w:vAlign w:val="center"/>
+            <w:tcMar>
+              <w:top w:w="80" w:type="dxa"/>
+              <w:start w:w="120" w:type="dxa"/>
+              <w:bottom w:w="80" w:type="dxa"/>
+              <w:end w:w="120" w:type="dxa"/>
+            </w:tcMar>
+          </w:tcPr>
+          <w:p>
+            <w:pPr>
+              <w:spacing w:after="0"/>
+            </w:pPr>
+            <w:r/>
+            <w:r>
+              <w:rPr>
+                <w:rFonts w:ascii="Songti SC" w:hAnsi="Songti SC" w:eastAsia="Songti SC" w:cs="Songti SC"/>
+                <w:b w:val="0"/>
+                <w:sz w:val="18"/>
+              </w:rPr>
+              <w:t>Agent 辅助拟制，待授权角色确认</w:t>
+            </w:r>
+          </w:p>
+        </w:tc>
+      </w:tr>
+      <w:tr>
+        <w:tc>
+          <w:tcPr>
+            <w:tcW w:type="dxa" w:w="1354"/>
+            <w:vAlign w:val="center"/>
+            <w:tcMar>
+              <w:top w:w="80" w:type="dxa"/>
+              <w:start w:w="120" w:type="dxa"/>
+              <w:bottom w:w="80" w:type="dxa"/>
+              <w:end w:w="120" w:type="dxa"/>
+            </w:tcMar>
+          </w:tcPr>
+          <w:p>
+            <w:pPr>
+              <w:spacing w:after="0"/>
+            </w:pPr>
+            <w:r/>
+            <w:r>
+              <w:rPr>
+                <w:rFonts w:ascii="Songti SC" w:hAnsi="Songti SC" w:eastAsia="Songti SC" w:cs="Songti SC"/>
                 <w:b w:val="0"/>
                 <w:sz w:val="18"/>
               </w:rPr>
@@ -1022,7 +1234,7 @@
             <w:r/>
             <w:r>
               <w:rPr>
-                <w:rFonts w:ascii="FangSong_GB2312" w:hAnsi="FangSong_GB2312" w:eastAsia="FangSong_GB2312" w:cs="FangSong_GB2312"/>
+                <w:rFonts w:ascii="Songti SC" w:hAnsi="Songti SC" w:eastAsia="Songti SC" w:cs="Songti SC"/>
                 <w:b w:val="0"/>
                 <w:sz w:val="18"/>
               </w:rPr>
@@ -1048,7 +1260,7 @@
             <w:r/>
             <w:r>
               <w:rPr>
-                <w:rFonts w:ascii="FangSong_GB2312" w:hAnsi="FangSong_GB2312" w:eastAsia="FangSong_GB2312" w:cs="FangSong_GB2312"/>
+                <w:rFonts w:ascii="Songti SC" w:hAnsi="Songti SC" w:eastAsia="Songti SC" w:cs="Songti SC"/>
                 <w:b w:val="0"/>
                 <w:sz w:val="18"/>
               </w:rPr>
@@ -1074,7 +1286,7 @@
             <w:r/>
             <w:r>
               <w:rPr>
-                <w:rFonts w:ascii="FangSong_GB2312" w:hAnsi="FangSong_GB2312" w:eastAsia="FangSong_GB2312" w:cs="FangSong_GB2312"/>
+                <w:rFonts w:ascii="Songti SC" w:hAnsi="Songti SC" w:eastAsia="Songti SC" w:cs="Songti SC"/>
                 <w:b w:val="0"/>
                 <w:sz w:val="18"/>
               </w:rPr>
@@ -1112,7 +1324,7 @@
       </w:pPr>
       <w:r>
         <w:rPr>
-          <w:rFonts w:ascii="FangSong_GB2312" w:hAnsi="FangSong_GB2312" w:eastAsia="FangSong_GB2312" w:cs="FangSong_GB2312"/>
+          <w:rFonts w:ascii="Songti SC" w:hAnsi="Songti SC" w:eastAsia="Songti SC" w:cs="Songti SC"/>
           <w:b w:val="0"/>
           <w:sz w:val="22"/>
         </w:rPr>
@@ -1129,7 +1341,7 @@
       </w:pPr>
       <w:r>
         <w:rPr>
-          <w:rFonts w:ascii="FangSong_GB2312" w:hAnsi="FangSong_GB2312" w:eastAsia="FangSong_GB2312" w:cs="FangSong_GB2312"/>
+          <w:rFonts w:ascii="Songti SC" w:hAnsi="Songti SC" w:eastAsia="Songti SC" w:cs="Songti SC"/>
           <w:b w:val="0"/>
           <w:sz w:val="22"/>
         </w:rPr>
@@ -1146,7 +1358,7 @@
       </w:pPr>
       <w:r>
         <w:rPr>
-          <w:rFonts w:ascii="FangSong_GB2312" w:hAnsi="FangSong_GB2312" w:eastAsia="FangSong_GB2312" w:cs="FangSong_GB2312"/>
+          <w:rFonts w:ascii="Songti SC" w:hAnsi="Songti SC" w:eastAsia="Songti SC" w:cs="Songti SC"/>
           <w:b w:val="0"/>
           <w:sz w:val="22"/>
         </w:rPr>
@@ -1163,7 +1375,7 @@
       </w:pPr>
       <w:r>
         <w:rPr>
-          <w:rFonts w:ascii="FangSong_GB2312" w:hAnsi="FangSong_GB2312" w:eastAsia="FangSong_GB2312" w:cs="FangSong_GB2312"/>
+          <w:rFonts w:ascii="Songti SC" w:hAnsi="Songti SC" w:eastAsia="Songti SC" w:cs="Songti SC"/>
           <w:b w:val="0"/>
           <w:sz w:val="22"/>
         </w:rPr>
@@ -1180,7 +1392,7 @@
       </w:pPr>
       <w:r>
         <w:rPr>
-          <w:rFonts w:ascii="FangSong_GB2312" w:hAnsi="FangSong_GB2312" w:eastAsia="FangSong_GB2312" w:cs="FangSong_GB2312"/>
+          <w:rFonts w:ascii="Songti SC" w:hAnsi="Songti SC" w:eastAsia="Songti SC" w:cs="Songti SC"/>
           <w:b w:val="0"/>
           <w:sz w:val="22"/>
         </w:rPr>
@@ -1197,7 +1409,7 @@
       </w:pPr>
       <w:r>
         <w:rPr>
-          <w:rFonts w:ascii="FangSong_GB2312" w:hAnsi="FangSong_GB2312" w:eastAsia="FangSong_GB2312" w:cs="FangSong_GB2312"/>
+          <w:rFonts w:ascii="Songti SC" w:hAnsi="Songti SC" w:eastAsia="Songti SC" w:cs="Songti SC"/>
           <w:b w:val="0"/>
           <w:sz w:val="22"/>
         </w:rPr>
@@ -1223,7 +1435,7 @@
       </w:pPr>
       <w:r>
         <w:rPr>
-          <w:rFonts w:ascii="FangSong_GB2312" w:hAnsi="FangSong_GB2312" w:eastAsia="FangSong_GB2312" w:cs="FangSong_GB2312"/>
+          <w:rFonts w:ascii="Songti SC" w:hAnsi="Songti SC" w:eastAsia="Songti SC" w:cs="Songti SC"/>
           <w:b w:val="0"/>
           <w:sz w:val="22"/>
         </w:rPr>
@@ -1240,11 +1452,11 @@
       </w:r>
       <w:r>
         <w:rPr>
-          <w:rFonts w:ascii="FangSong_GB2312" w:hAnsi="FangSong_GB2312" w:eastAsia="FangSong_GB2312" w:cs="FangSong_GB2312"/>
+          <w:rFonts w:ascii="Songti SC" w:hAnsi="Songti SC" w:eastAsia="Songti SC" w:cs="Songti SC"/>
           <w:b w:val="0"/>
           <w:sz w:val="22"/>
         </w:rPr>
-        <w:t xml:space="preserve"> 的文档类型、证据边界、项目假设和裁剪候选。目录原始 Golden 同样由 AI 生成，不是天然真值、批准样本或标准符合样本；v2.3 仍是候选，只是按可核对的代码、测试证据、项目责任人决策和仓库标准参考集进行了整改。</w:t>
+        <w:t xml:space="preserve"> 的文档类型、证据边界、项目假设和裁剪候选。目录原始 Golden 同样由 AI 生成，不是天然真值、批准样本或标准符合样本；v2.5 仍是候选，只是按可核对的代码、真实 Vivado/Connector 证据、项目责任人决策和仓库标准参考集进行了整改。</w:t>
       </w:r>
     </w:p>
     <w:p>
@@ -1261,7 +1473,7 @@
       </w:pPr>
       <w:r>
         <w:rPr>
-          <w:rFonts w:ascii="FangSong_GB2312" w:hAnsi="FangSong_GB2312" w:eastAsia="FangSong_GB2312" w:cs="FangSong_GB2312"/>
+          <w:rFonts w:ascii="Songti SC" w:hAnsi="Songti SC" w:eastAsia="Songti SC" w:cs="Songti SC"/>
           <w:b w:val="0"/>
           <w:sz w:val="22"/>
         </w:rPr>
@@ -1278,7 +1490,7 @@
       </w:r>
       <w:r>
         <w:rPr>
-          <w:rFonts w:ascii="FangSong_GB2312" w:hAnsi="FangSong_GB2312" w:eastAsia="FangSong_GB2312" w:cs="FangSong_GB2312"/>
+          <w:rFonts w:ascii="Songti SC" w:hAnsi="Songti SC" w:eastAsia="Songti SC" w:cs="Songti SC"/>
           <w:b w:val="0"/>
           <w:sz w:val="22"/>
         </w:rPr>
@@ -1291,7 +1503,7 @@
       </w:pPr>
       <w:r>
         <w:rPr>
-          <w:rFonts w:ascii="FangSong_GB2312" w:hAnsi="FangSong_GB2312" w:eastAsia="FangSong_GB2312" w:cs="FangSong_GB2312"/>
+          <w:rFonts w:ascii="Songti SC" w:hAnsi="Songti SC" w:eastAsia="Songti SC" w:cs="Songti SC"/>
           <w:b w:val="0"/>
           <w:sz w:val="22"/>
         </w:rPr>
@@ -1308,7 +1520,7 @@
       </w:r>
       <w:r>
         <w:rPr>
-          <w:rFonts w:ascii="FangSong_GB2312" w:hAnsi="FangSong_GB2312" w:eastAsia="FangSong_GB2312" w:cs="FangSong_GB2312"/>
+          <w:rFonts w:ascii="Songti SC" w:hAnsi="Songti SC" w:eastAsia="Songti SC" w:cs="Songti SC"/>
           <w:b w:val="0"/>
           <w:sz w:val="22"/>
         </w:rPr>
@@ -1325,7 +1537,7 @@
       </w:r>
       <w:r>
         <w:rPr>
-          <w:rFonts w:ascii="FangSong_GB2312" w:hAnsi="FangSong_GB2312" w:eastAsia="FangSong_GB2312" w:cs="FangSong_GB2312"/>
+          <w:rFonts w:ascii="Songti SC" w:hAnsi="Songti SC" w:eastAsia="Songti SC" w:cs="Songti SC"/>
           <w:b w:val="0"/>
           <w:sz w:val="22"/>
         </w:rPr>
@@ -1376,7 +1588,7 @@
             <w:r/>
             <w:r>
               <w:rPr>
-                <w:rFonts w:ascii="FangSong_GB2312" w:hAnsi="FangSong_GB2312" w:eastAsia="FangSong_GB2312" w:cs="FangSong_GB2312"/>
+                <w:rFonts w:ascii="Songti SC" w:hAnsi="Songti SC" w:eastAsia="Songti SC" w:cs="Songti SC"/>
                 <w:b/>
                 <w:sz w:val="18"/>
               </w:rPr>
@@ -1403,7 +1615,7 @@
             <w:r/>
             <w:r>
               <w:rPr>
-                <w:rFonts w:ascii="FangSong_GB2312" w:hAnsi="FangSong_GB2312" w:eastAsia="FangSong_GB2312" w:cs="FangSong_GB2312"/>
+                <w:rFonts w:ascii="Songti SC" w:hAnsi="Songti SC" w:eastAsia="Songti SC" w:cs="Songti SC"/>
                 <w:b/>
                 <w:sz w:val="18"/>
               </w:rPr>
@@ -1430,7 +1642,7 @@
             <w:r/>
             <w:r>
               <w:rPr>
-                <w:rFonts w:ascii="FangSong_GB2312" w:hAnsi="FangSong_GB2312" w:eastAsia="FangSong_GB2312" w:cs="FangSong_GB2312"/>
+                <w:rFonts w:ascii="Songti SC" w:hAnsi="Songti SC" w:eastAsia="Songti SC" w:cs="Songti SC"/>
                 <w:b/>
                 <w:sz w:val="18"/>
               </w:rPr>
@@ -1458,7 +1670,7 @@
             <w:r/>
             <w:r>
               <w:rPr>
-                <w:rFonts w:ascii="FangSong_GB2312" w:hAnsi="FangSong_GB2312" w:eastAsia="FangSong_GB2312" w:cs="FangSong_GB2312"/>
+                <w:rFonts w:ascii="Songti SC" w:hAnsi="Songti SC" w:eastAsia="Songti SC" w:cs="Songti SC"/>
                 <w:b w:val="0"/>
                 <w:sz w:val="18"/>
               </w:rPr>
@@ -1484,7 +1696,7 @@
             <w:r/>
             <w:r>
               <w:rPr>
-                <w:rFonts w:ascii="FangSong_GB2312" w:hAnsi="FangSong_GB2312" w:eastAsia="FangSong_GB2312" w:cs="FangSong_GB2312"/>
+                <w:rFonts w:ascii="Songti SC" w:hAnsi="Songti SC" w:eastAsia="Songti SC" w:cs="Songti SC"/>
                 <w:b w:val="0"/>
                 <w:sz w:val="18"/>
               </w:rPr>
@@ -1510,7 +1722,7 @@
             <w:r/>
             <w:r>
               <w:rPr>
-                <w:rFonts w:ascii="FangSong_GB2312" w:hAnsi="FangSong_GB2312" w:eastAsia="FangSong_GB2312" w:cs="FangSong_GB2312"/>
+                <w:rFonts w:ascii="Songti SC" w:hAnsi="Songti SC" w:eastAsia="Songti SC" w:cs="Songti SC"/>
                 <w:b w:val="0"/>
                 <w:sz w:val="18"/>
               </w:rPr>
@@ -1538,7 +1750,7 @@
             <w:r/>
             <w:r>
               <w:rPr>
-                <w:rFonts w:ascii="FangSong_GB2312" w:hAnsi="FangSong_GB2312" w:eastAsia="FangSong_GB2312" w:cs="FangSong_GB2312"/>
+                <w:rFonts w:ascii="Songti SC" w:hAnsi="Songti SC" w:eastAsia="Songti SC" w:cs="Songti SC"/>
                 <w:b w:val="0"/>
                 <w:sz w:val="18"/>
               </w:rPr>
@@ -1564,11 +1776,11 @@
             <w:r/>
             <w:r>
               <w:rPr>
-                <w:rFonts w:ascii="FangSong_GB2312" w:hAnsi="FangSong_GB2312" w:eastAsia="FangSong_GB2312" w:cs="FangSong_GB2312"/>
+                <w:rFonts w:ascii="Songti SC" w:hAnsi="Songti SC" w:eastAsia="Songti SC" w:cs="Songti SC"/>
                 <w:b w:val="0"/>
                 <w:sz w:val="18"/>
               </w:rPr>
-              <w:t xml:space="preserve">AMD Xilinx Virtex-7 XC7VX690T；候选 part </w:t>
+              <w:t xml:space="preserve">AMD Xilinx Virtex-7 XC7VX690T；part </w:t>
             </w:r>
             <w:r>
               <w:rPr>
@@ -1599,11 +1811,11 @@
             <w:r/>
             <w:r>
               <w:rPr>
-                <w:rFonts w:ascii="FangSong_GB2312" w:hAnsi="FangSong_GB2312" w:eastAsia="FangSong_GB2312" w:cs="FangSong_GB2312"/>
+                <w:rFonts w:ascii="Songti SC" w:hAnsi="Songti SC" w:eastAsia="Songti SC" w:cs="Songti SC"/>
                 <w:b w:val="0"/>
                 <w:sz w:val="18"/>
               </w:rPr>
-              <w:t xml:space="preserve">用户已选器件级别；候选 part 尚未被真实 Connector </w:t>
+              <w:t xml:space="preserve">独立 Connector </w:t>
             </w:r>
             <w:r>
               <w:rPr>
@@ -1612,15 +1824,15 @@
                 <w:color w:val="1F3A5F"/>
                 <w:sz w:val="17"/>
               </w:rPr>
-              <w:t>get_parts</w:t>
+              <w:t>vivado-66-vc709</w:t>
             </w:r>
             <w:r>
               <w:rPr>
-                <w:rFonts w:ascii="FangSong_GB2312" w:hAnsi="FangSong_GB2312" w:eastAsia="FangSong_GB2312" w:cs="FangSong_GB2312"/>
+                <w:rFonts w:ascii="Songti SC" w:hAnsi="Songti SC" w:eastAsia="Songti SC" w:cs="Songti SC"/>
                 <w:b w:val="0"/>
                 <w:sz w:val="18"/>
               </w:rPr>
-              <w:t xml:space="preserve"> 确认，旧 worker-66 明确不包含该 part</w:t>
+              <w:t xml:space="preserve"> 的 Vivado 2021.1 已精确返回并完成综合/布局布线</w:t>
             </w:r>
           </w:p>
         </w:tc>
@@ -1644,7 +1856,7 @@
             <w:r/>
             <w:r>
               <w:rPr>
-                <w:rFonts w:ascii="FangSong_GB2312" w:hAnsi="FangSong_GB2312" w:eastAsia="FangSong_GB2312" w:cs="FangSong_GB2312"/>
+                <w:rFonts w:ascii="Songti SC" w:hAnsi="Songti SC" w:eastAsia="Songti SC" w:cs="Songti SC"/>
                 <w:b w:val="0"/>
                 <w:sz w:val="18"/>
               </w:rPr>
@@ -1670,11 +1882,11 @@
             <w:r/>
             <w:r>
               <w:rPr>
-                <w:rFonts w:ascii="FangSong_GB2312" w:hAnsi="FangSong_GB2312" w:eastAsia="FangSong_GB2312" w:cs="FangSong_GB2312"/>
+                <w:rFonts w:ascii="Songti SC" w:hAnsi="Songti SC" w:eastAsia="Songti SC" w:cs="Songti SC"/>
                 <w:b w:val="0"/>
                 <w:sz w:val="18"/>
               </w:rPr>
-              <w:t>Virtex-7 690T 板卡；</w:t>
+              <w:t>AMD/Xilinx VC709 Rev 1.0 候选；</w:t>
             </w:r>
             <w:r>
               <w:rPr>
@@ -1687,11 +1899,11 @@
             </w:r>
             <w:r>
               <w:rPr>
-                <w:rFonts w:ascii="FangSong_GB2312" w:hAnsi="FangSong_GB2312" w:eastAsia="FangSong_GB2312" w:cs="FangSong_GB2312"/>
+                <w:rFonts w:ascii="Songti SC" w:hAnsi="Songti SC" w:eastAsia="Songti SC" w:cs="Songti SC"/>
                 <w:b w:val="0"/>
                 <w:sz w:val="18"/>
               </w:rPr>
-              <w:t xml:space="preserve"> 通用核 + </w:t>
+              <w:t xml:space="preserve"> + </w:t>
             </w:r>
             <w:r>
               <w:rPr>
@@ -1704,11 +1916,11 @@
             </w:r>
             <w:r>
               <w:rPr>
-                <w:rFonts w:ascii="FangSong_GB2312" w:hAnsi="FangSong_GB2312" w:eastAsia="FangSong_GB2312" w:cs="FangSong_GB2312"/>
+                <w:rFonts w:ascii="Songti SC" w:hAnsi="Songti SC" w:eastAsia="Songti SC" w:cs="Songti SC"/>
                 <w:b w:val="0"/>
                 <w:sz w:val="18"/>
               </w:rPr>
-              <w:t xml:space="preserve"> 板级包装；板载 USB-UART</w:t>
+              <w:t>；CP2103 USB-UART</w:t>
             </w:r>
           </w:p>
         </w:tc>
@@ -1730,11 +1942,11 @@
             <w:r/>
             <w:r>
               <w:rPr>
-                <w:rFonts w:ascii="FangSong_GB2312" w:hAnsi="FangSong_GB2312" w:eastAsia="FangSong_GB2312" w:cs="FangSong_GB2312"/>
+                <w:rFonts w:ascii="Songti SC" w:hAnsi="Songti SC" w:eastAsia="Songti SC" w:cs="Songti SC"/>
                 <w:b w:val="0"/>
                 <w:sz w:val="18"/>
               </w:rPr>
-              <w:t>拓扑已决策；制造商/型号/修订和包装实现待权威板级资料</w:t>
+              <w:t>UG887 v1.6、XTP213 Rev 1.0 原理图和官方 Master XDC 已入库交叉确认器件、200 MHz 时钟、复位、UART、管脚和电气事实</w:t>
             </w:r>
           </w:p>
         </w:tc>
@@ -1758,7 +1970,7 @@
             <w:r/>
             <w:r>
               <w:rPr>
-                <w:rFonts w:ascii="FangSong_GB2312" w:hAnsi="FangSong_GB2312" w:eastAsia="FangSong_GB2312" w:cs="FangSong_GB2312"/>
+                <w:rFonts w:ascii="Songti SC" w:hAnsi="Songti SC" w:eastAsia="Songti SC" w:cs="Songti SC"/>
                 <w:b w:val="0"/>
                 <w:sz w:val="18"/>
               </w:rPr>
@@ -1784,11 +1996,28 @@
             <w:r/>
             <w:r>
               <w:rPr>
-                <w:rFonts w:ascii="FangSong_GB2312" w:hAnsi="FangSong_GB2312" w:eastAsia="FangSong_GB2312" w:cs="FangSong_GB2312"/>
+                <w:rFonts w:ascii="Songti SC" w:hAnsi="Songti SC" w:eastAsia="Songti SC" w:cs="Songti SC"/>
                 <w:b w:val="0"/>
                 <w:sz w:val="18"/>
               </w:rPr>
-              <w:t>目标为包含所选 690T part 的 Vivado/Connector profile；Icarus 仅作交叉检查</w:t>
+              <w:t xml:space="preserve">Vivado/XSim 2021.1 build 3247384；profile </w:t>
+            </w:r>
+            <w:r>
+              <w:rPr>
+                <w:rFonts w:ascii="Courier New" w:hAnsi="Courier New" w:eastAsia="Courier New" w:cs="Courier New"/>
+                <w:b w:val="0"/>
+                <w:color w:val="1F3A5F"/>
+                <w:sz w:val="17"/>
+              </w:rPr>
+              <w:t>dffba16f…88bc</w:t>
+            </w:r>
+            <w:r>
+              <w:rPr>
+                <w:rFonts w:ascii="Songti SC" w:hAnsi="Songti SC" w:eastAsia="Songti SC" w:cs="Songti SC"/>
+                <w:b w:val="0"/>
+                <w:sz w:val="18"/>
+              </w:rPr>
+              <w:t>；Icarus 仅作交叉检查</w:t>
             </w:r>
           </w:p>
         </w:tc>
@@ -1810,11 +2039,11 @@
             <w:r/>
             <w:r>
               <w:rPr>
-                <w:rFonts w:ascii="FangSong_GB2312" w:hAnsi="FangSong_GB2312" w:eastAsia="FangSong_GB2312" w:cs="FangSong_GB2312"/>
+                <w:rFonts w:ascii="Songti SC" w:hAnsi="Songti SC" w:eastAsia="Songti SC" w:cs="Songti SC"/>
                 <w:b w:val="0"/>
                 <w:sz w:val="18"/>
               </w:rPr>
-              <w:t>旧 Vivado 2021.1 / K70T exploratory 证据不支持当前 690T 目标结论</w:t>
+              <w:t>9600/115200、综合和预码流实现均为 exploratory/candidate，不是批准证据</w:t>
             </w:r>
           </w:p>
         </w:tc>
@@ -1838,7 +2067,7 @@
             <w:r/>
             <w:r>
               <w:rPr>
-                <w:rFonts w:ascii="FangSong_GB2312" w:hAnsi="FangSong_GB2312" w:eastAsia="FangSong_GB2312" w:cs="FangSong_GB2312"/>
+                <w:rFonts w:ascii="Songti SC" w:hAnsi="Songti SC" w:eastAsia="Songti SC" w:cs="Songti SC"/>
                 <w:b w:val="0"/>
                 <w:sz w:val="18"/>
               </w:rPr>
@@ -1864,7 +2093,7 @@
             <w:r/>
             <w:r>
               <w:rPr>
-                <w:rFonts w:ascii="FangSong_GB2312" w:hAnsi="FangSong_GB2312" w:eastAsia="FangSong_GB2312" w:cs="FangSong_GB2312"/>
+                <w:rFonts w:ascii="Songti SC" w:hAnsi="Songti SC" w:eastAsia="Songti SC" w:cs="Songti SC"/>
                 <w:b w:val="0"/>
                 <w:sz w:val="18"/>
               </w:rPr>
@@ -1890,7 +2119,7 @@
             <w:r/>
             <w:r>
               <w:rPr>
-                <w:rFonts w:ascii="FangSong_GB2312" w:hAnsi="FangSong_GB2312" w:eastAsia="FangSong_GB2312" w:cs="FangSong_GB2312"/>
+                <w:rFonts w:ascii="Songti SC" w:hAnsi="Songti SC" w:eastAsia="Songti SC" w:cs="Songti SC"/>
                 <w:b w:val="0"/>
                 <w:sz w:val="18"/>
               </w:rPr>
@@ -1918,7 +2147,7 @@
             <w:r/>
             <w:r>
               <w:rPr>
-                <w:rFonts w:ascii="FangSong_GB2312" w:hAnsi="FangSong_GB2312" w:eastAsia="FangSong_GB2312" w:cs="FangSong_GB2312"/>
+                <w:rFonts w:ascii="Songti SC" w:hAnsi="Songti SC" w:eastAsia="Songti SC" w:cs="Songti SC"/>
                 <w:b w:val="0"/>
                 <w:sz w:val="18"/>
               </w:rPr>
@@ -1944,7 +2173,7 @@
             <w:r/>
             <w:r>
               <w:rPr>
-                <w:rFonts w:ascii="FangSong_GB2312" w:hAnsi="FangSong_GB2312" w:eastAsia="FangSong_GB2312" w:cs="FangSong_GB2312"/>
+                <w:rFonts w:ascii="Songti SC" w:hAnsi="Songti SC" w:eastAsia="Songti SC" w:cs="Songti SC"/>
                 <w:b w:val="0"/>
                 <w:sz w:val="18"/>
               </w:rPr>
@@ -1970,7 +2199,7 @@
             <w:r/>
             <w:r>
               <w:rPr>
-                <w:rFonts w:ascii="FangSong_GB2312" w:hAnsi="FangSong_GB2312" w:eastAsia="FangSong_GB2312" w:cs="FangSong_GB2312"/>
+                <w:rFonts w:ascii="Songti SC" w:hAnsi="Songti SC" w:eastAsia="Songti SC" w:cs="Songti SC"/>
                 <w:b w:val="0"/>
                 <w:sz w:val="18"/>
               </w:rPr>
@@ -1998,7 +2227,7 @@
             <w:r/>
             <w:r>
               <w:rPr>
-                <w:rFonts w:ascii="FangSong_GB2312" w:hAnsi="FangSong_GB2312" w:eastAsia="FangSong_GB2312" w:cs="FangSong_GB2312"/>
+                <w:rFonts w:ascii="Songti SC" w:hAnsi="Songti SC" w:eastAsia="Songti SC" w:cs="Songti SC"/>
                 <w:b w:val="0"/>
                 <w:sz w:val="18"/>
               </w:rPr>
@@ -2024,11 +2253,11 @@
             <w:r/>
             <w:r>
               <w:rPr>
-                <w:rFonts w:ascii="FangSong_GB2312" w:hAnsi="FangSong_GB2312" w:eastAsia="FangSong_GB2312" w:cs="FangSong_GB2312"/>
+                <w:rFonts w:ascii="Songti SC" w:hAnsi="Songti SC" w:eastAsia="Songti SC" w:cs="Songti SC"/>
                 <w:b w:val="0"/>
                 <w:sz w:val="18"/>
               </w:rPr>
-              <w:t>仅有 100 MHz 核时钟需求；物理实现事实未提供</w:t>
+              <w:t>SYSCLK H19/G18 DIFF_SSTL15；RESET AV40；UART AU36/AU33 LVCMOS18；200→100 MHz MMCM</w:t>
             </w:r>
           </w:p>
         </w:tc>
@@ -2050,11 +2279,11 @@
             <w:r/>
             <w:r>
               <w:rPr>
-                <w:rFonts w:ascii="FangSong_GB2312" w:hAnsi="FangSong_GB2312" w:eastAsia="FangSong_GB2312" w:cs="FangSong_GB2312"/>
+                <w:rFonts w:ascii="Songti SC" w:hAnsi="Songti SC" w:eastAsia="Songti SC" w:cs="Songti SC"/>
                 <w:b w:val="0"/>
                 <w:sz w:val="18"/>
               </w:rPr>
-              <w:t>必须由原理图、官方 Master XDC/管脚表、USB-UART 连接、晶振/复位与 Bank VCCO/IOSTANDARD 证据推导；阻断正式 XDC、确认测试、码流和交付</w:t>
+              <w:t>候选约束已与 XTP213/Master XDC 交叉核对，并通过 Mac→66 直连完成修订后预码流重跑；未生成 bitstream，无实物板卡修订确认/仪器/批准规程，故确认测试和交付仍阻塞</w:t>
             </w:r>
           </w:p>
         </w:tc>
@@ -2078,7 +2307,7 @@
             <w:r/>
             <w:r>
               <w:rPr>
-                <w:rFonts w:ascii="FangSong_GB2312" w:hAnsi="FangSong_GB2312" w:eastAsia="FangSong_GB2312" w:cs="FangSong_GB2312"/>
+                <w:rFonts w:ascii="Songti SC" w:hAnsi="Songti SC" w:eastAsia="Songti SC" w:cs="Songti SC"/>
                 <w:b w:val="0"/>
                 <w:sz w:val="18"/>
               </w:rPr>
@@ -2104,7 +2333,7 @@
             <w:r/>
             <w:r>
               <w:rPr>
-                <w:rFonts w:ascii="FangSong_GB2312" w:hAnsi="FangSong_GB2312" w:eastAsia="FangSong_GB2312" w:cs="FangSong_GB2312"/>
+                <w:rFonts w:ascii="Songti SC" w:hAnsi="Songti SC" w:eastAsia="Songti SC" w:cs="Songti SC"/>
                 <w:b w:val="0"/>
                 <w:sz w:val="18"/>
               </w:rPr>
@@ -2130,7 +2359,7 @@
             <w:r/>
             <w:r>
               <w:rPr>
-                <w:rFonts w:ascii="FangSong_GB2312" w:hAnsi="FangSong_GB2312" w:eastAsia="FangSong_GB2312" w:cs="FangSong_GB2312"/>
+                <w:rFonts w:ascii="Songti SC" w:hAnsi="Songti SC" w:eastAsia="Songti SC" w:cs="Songti SC"/>
                 <w:b w:val="0"/>
                 <w:sz w:val="18"/>
               </w:rPr>
@@ -2158,7 +2387,7 @@
             <w:r/>
             <w:r>
               <w:rPr>
-                <w:rFonts w:ascii="FangSong_GB2312" w:hAnsi="FangSong_GB2312" w:eastAsia="FangSong_GB2312" w:cs="FangSong_GB2312"/>
+                <w:rFonts w:ascii="Songti SC" w:hAnsi="Songti SC" w:eastAsia="Songti SC" w:cs="Songti SC"/>
                 <w:b w:val="0"/>
                 <w:sz w:val="18"/>
               </w:rPr>
@@ -2184,7 +2413,7 @@
             <w:r/>
             <w:r>
               <w:rPr>
-                <w:rFonts w:ascii="FangSong_GB2312" w:hAnsi="FangSong_GB2312" w:eastAsia="FangSong_GB2312" w:cs="FangSong_GB2312"/>
+                <w:rFonts w:ascii="Songti SC" w:hAnsi="Songti SC" w:eastAsia="Songti SC" w:cs="Songti SC"/>
                 <w:b w:val="0"/>
                 <w:sz w:val="18"/>
               </w:rPr>
@@ -2210,7 +2439,7 @@
             <w:r/>
             <w:r>
               <w:rPr>
-                <w:rFonts w:ascii="FangSong_GB2312" w:hAnsi="FangSong_GB2312" w:eastAsia="FangSong_GB2312" w:cs="FangSong_GB2312"/>
+                <w:rFonts w:ascii="Songti SC" w:hAnsi="Songti SC" w:eastAsia="Songti SC" w:cs="Songti SC"/>
                 <w:b w:val="0"/>
                 <w:sz w:val="18"/>
               </w:rPr>
@@ -2277,7 +2506,7 @@
             <w:r/>
             <w:r>
               <w:rPr>
-                <w:rFonts w:ascii="FangSong_GB2312" w:hAnsi="FangSong_GB2312" w:eastAsia="FangSong_GB2312" w:cs="FangSong_GB2312"/>
+                <w:rFonts w:ascii="Songti SC" w:hAnsi="Songti SC" w:eastAsia="Songti SC" w:cs="Songti SC"/>
                 <w:b/>
                 <w:sz w:val="18"/>
               </w:rPr>
@@ -2304,7 +2533,7 @@
             <w:r/>
             <w:r>
               <w:rPr>
-                <w:rFonts w:ascii="FangSong_GB2312" w:hAnsi="FangSong_GB2312" w:eastAsia="FangSong_GB2312" w:cs="FangSong_GB2312"/>
+                <w:rFonts w:ascii="Songti SC" w:hAnsi="Songti SC" w:eastAsia="Songti SC" w:cs="Songti SC"/>
                 <w:b/>
                 <w:sz w:val="18"/>
               </w:rPr>
@@ -2331,7 +2560,7 @@
             <w:r/>
             <w:r>
               <w:rPr>
-                <w:rFonts w:ascii="FangSong_GB2312" w:hAnsi="FangSong_GB2312" w:eastAsia="FangSong_GB2312" w:cs="FangSong_GB2312"/>
+                <w:rFonts w:ascii="Songti SC" w:hAnsi="Songti SC" w:eastAsia="Songti SC" w:cs="Songti SC"/>
                 <w:b/>
                 <w:sz w:val="18"/>
               </w:rPr>
@@ -2359,7 +2588,7 @@
             <w:r/>
             <w:r>
               <w:rPr>
-                <w:rFonts w:ascii="FangSong_GB2312" w:hAnsi="FangSong_GB2312" w:eastAsia="FangSong_GB2312" w:cs="FangSong_GB2312"/>
+                <w:rFonts w:ascii="Songti SC" w:hAnsi="Songti SC" w:eastAsia="Songti SC" w:cs="Songti SC"/>
                 <w:b w:val="0"/>
                 <w:sz w:val="18"/>
               </w:rPr>
@@ -2385,7 +2614,7 @@
             <w:r/>
             <w:r>
               <w:rPr>
-                <w:rFonts w:ascii="FangSong_GB2312" w:hAnsi="FangSong_GB2312" w:eastAsia="FangSong_GB2312" w:cs="FangSong_GB2312"/>
+                <w:rFonts w:ascii="Songti SC" w:hAnsi="Songti SC" w:eastAsia="Songti SC" w:cs="Songti SC"/>
                 <w:b w:val="0"/>
                 <w:sz w:val="18"/>
               </w:rPr>
@@ -2411,11 +2640,11 @@
             <w:r/>
             <w:r>
               <w:rPr>
-                <w:rFonts w:ascii="FangSong_GB2312" w:hAnsi="FangSong_GB2312" w:eastAsia="FangSong_GB2312" w:cs="FangSong_GB2312"/>
+                <w:rFonts w:ascii="Songti SC" w:hAnsi="Songti SC" w:eastAsia="Songti SC" w:cs="Songti SC"/>
                 <w:b w:val="0"/>
                 <w:sz w:val="18"/>
               </w:rPr>
-              <w:t>v2.3 candidate</w:t>
+              <w:t>v2.5 candidate</w:t>
             </w:r>
           </w:p>
         </w:tc>
@@ -2439,7 +2668,7 @@
             <w:r/>
             <w:r>
               <w:rPr>
-                <w:rFonts w:ascii="FangSong_GB2312" w:hAnsi="FangSong_GB2312" w:eastAsia="FangSong_GB2312" w:cs="FangSong_GB2312"/>
+                <w:rFonts w:ascii="Songti SC" w:hAnsi="Songti SC" w:eastAsia="Songti SC" w:cs="Songti SC"/>
                 <w:b w:val="0"/>
                 <w:sz w:val="18"/>
               </w:rPr>
@@ -2465,7 +2694,7 @@
             <w:r/>
             <w:r>
               <w:rPr>
-                <w:rFonts w:ascii="FangSong_GB2312" w:hAnsi="FangSong_GB2312" w:eastAsia="FangSong_GB2312" w:cs="FangSong_GB2312"/>
+                <w:rFonts w:ascii="Songti SC" w:hAnsi="Songti SC" w:eastAsia="Songti SC" w:cs="Songti SC"/>
                 <w:b w:val="0"/>
                 <w:sz w:val="18"/>
               </w:rPr>
@@ -2491,11 +2720,11 @@
             <w:r/>
             <w:r>
               <w:rPr>
-                <w:rFonts w:ascii="FangSong_GB2312" w:hAnsi="FangSong_GB2312" w:eastAsia="FangSong_GB2312" w:cs="FangSong_GB2312"/>
+                <w:rFonts w:ascii="Songti SC" w:hAnsi="Songti SC" w:eastAsia="Songti SC" w:cs="Songti SC"/>
                 <w:b w:val="0"/>
                 <w:sz w:val="18"/>
               </w:rPr>
-              <w:t>v2.3 candidate</w:t>
+              <w:t>v2.5 candidate</w:t>
             </w:r>
           </w:p>
         </w:tc>
@@ -2519,7 +2748,7 @@
             <w:r/>
             <w:r>
               <w:rPr>
-                <w:rFonts w:ascii="FangSong_GB2312" w:hAnsi="FangSong_GB2312" w:eastAsia="FangSong_GB2312" w:cs="FangSong_GB2312"/>
+                <w:rFonts w:ascii="Songti SC" w:hAnsi="Songti SC" w:eastAsia="Songti SC" w:cs="Songti SC"/>
                 <w:b w:val="0"/>
                 <w:sz w:val="18"/>
               </w:rPr>
@@ -2545,7 +2774,7 @@
             <w:r/>
             <w:r>
               <w:rPr>
-                <w:rFonts w:ascii="FangSong_GB2312" w:hAnsi="FangSong_GB2312" w:eastAsia="FangSong_GB2312" w:cs="FangSong_GB2312"/>
+                <w:rFonts w:ascii="Songti SC" w:hAnsi="Songti SC" w:eastAsia="Songti SC" w:cs="Songti SC"/>
                 <w:b w:val="0"/>
                 <w:sz w:val="18"/>
               </w:rPr>
@@ -2571,11 +2800,11 @@
             <w:r/>
             <w:r>
               <w:rPr>
-                <w:rFonts w:ascii="FangSong_GB2312" w:hAnsi="FangSong_GB2312" w:eastAsia="FangSong_GB2312" w:cs="FangSong_GB2312"/>
+                <w:rFonts w:ascii="Songti SC" w:hAnsi="Songti SC" w:eastAsia="Songti SC" w:cs="Songti SC"/>
                 <w:b w:val="0"/>
                 <w:sz w:val="18"/>
               </w:rPr>
-              <w:t>v2.3 candidate；合并原结构/详细设计</w:t>
+              <w:t>v2.5 candidate；合并原结构/详细设计</w:t>
             </w:r>
           </w:p>
         </w:tc>
@@ -2599,7 +2828,7 @@
             <w:r/>
             <w:r>
               <w:rPr>
-                <w:rFonts w:ascii="FangSong_GB2312" w:hAnsi="FangSong_GB2312" w:eastAsia="FangSong_GB2312" w:cs="FangSong_GB2312"/>
+                <w:rFonts w:ascii="Songti SC" w:hAnsi="Songti SC" w:eastAsia="Songti SC" w:cs="Songti SC"/>
                 <w:b w:val="0"/>
                 <w:sz w:val="18"/>
               </w:rPr>
@@ -2625,7 +2854,7 @@
             <w:r/>
             <w:r>
               <w:rPr>
-                <w:rFonts w:ascii="FangSong_GB2312" w:hAnsi="FangSong_GB2312" w:eastAsia="FangSong_GB2312" w:cs="FangSong_GB2312"/>
+                <w:rFonts w:ascii="Songti SC" w:hAnsi="Songti SC" w:eastAsia="Songti SC" w:cs="Songti SC"/>
                 <w:b w:val="0"/>
                 <w:sz w:val="18"/>
               </w:rPr>
@@ -2651,11 +2880,11 @@
             <w:r/>
             <w:r>
               <w:rPr>
-                <w:rFonts w:ascii="FangSong_GB2312" w:hAnsi="FangSong_GB2312" w:eastAsia="FangSong_GB2312" w:cs="FangSong_GB2312"/>
+                <w:rFonts w:ascii="Songti SC" w:hAnsi="Songti SC" w:eastAsia="Songti SC" w:cs="Songti SC"/>
                 <w:b w:val="0"/>
                 <w:sz w:val="18"/>
               </w:rPr>
-              <w:t>v2.3 candidate</w:t>
+              <w:t>v2.5 candidate</w:t>
             </w:r>
           </w:p>
         </w:tc>
@@ -2679,7 +2908,7 @@
             <w:r/>
             <w:r>
               <w:rPr>
-                <w:rFonts w:ascii="FangSong_GB2312" w:hAnsi="FangSong_GB2312" w:eastAsia="FangSong_GB2312" w:cs="FangSong_GB2312"/>
+                <w:rFonts w:ascii="Songti SC" w:hAnsi="Songti SC" w:eastAsia="Songti SC" w:cs="Songti SC"/>
                 <w:b w:val="0"/>
                 <w:sz w:val="18"/>
               </w:rPr>
@@ -2705,7 +2934,7 @@
             <w:r/>
             <w:r>
               <w:rPr>
-                <w:rFonts w:ascii="FangSong_GB2312" w:hAnsi="FangSong_GB2312" w:eastAsia="FangSong_GB2312" w:cs="FangSong_GB2312"/>
+                <w:rFonts w:ascii="Songti SC" w:hAnsi="Songti SC" w:eastAsia="Songti SC" w:cs="Songti SC"/>
                 <w:b w:val="0"/>
                 <w:sz w:val="18"/>
               </w:rPr>
@@ -2731,11 +2960,11 @@
             <w:r/>
             <w:r>
               <w:rPr>
-                <w:rFonts w:ascii="FangSong_GB2312" w:hAnsi="FangSong_GB2312" w:eastAsia="FangSong_GB2312" w:cs="FangSong_GB2312"/>
+                <w:rFonts w:ascii="Songti SC" w:hAnsi="Songti SC" w:eastAsia="Songti SC" w:cs="Songti SC"/>
                 <w:b w:val="0"/>
                 <w:sz w:val="18"/>
               </w:rPr>
-              <w:t>v2.3 candidate</w:t>
+              <w:t>v2.5 candidate</w:t>
             </w:r>
           </w:p>
         </w:tc>
@@ -2759,7 +2988,7 @@
             <w:r/>
             <w:r>
               <w:rPr>
-                <w:rFonts w:ascii="FangSong_GB2312" w:hAnsi="FangSong_GB2312" w:eastAsia="FangSong_GB2312" w:cs="FangSong_GB2312"/>
+                <w:rFonts w:ascii="Songti SC" w:hAnsi="Songti SC" w:eastAsia="Songti SC" w:cs="Songti SC"/>
                 <w:b w:val="0"/>
                 <w:sz w:val="18"/>
               </w:rPr>
@@ -2785,7 +3014,7 @@
             <w:r/>
             <w:r>
               <w:rPr>
-                <w:rFonts w:ascii="FangSong_GB2312" w:hAnsi="FangSong_GB2312" w:eastAsia="FangSong_GB2312" w:cs="FangSong_GB2312"/>
+                <w:rFonts w:ascii="Songti SC" w:hAnsi="Songti SC" w:eastAsia="Songti SC" w:cs="Songti SC"/>
                 <w:b w:val="0"/>
                 <w:sz w:val="18"/>
               </w:rPr>
@@ -2811,11 +3040,11 @@
             <w:r/>
             <w:r>
               <w:rPr>
-                <w:rFonts w:ascii="FangSong_GB2312" w:hAnsi="FangSong_GB2312" w:eastAsia="FangSong_GB2312" w:cs="FangSong_GB2312"/>
+                <w:rFonts w:ascii="Songti SC" w:hAnsi="Songti SC" w:eastAsia="Songti SC" w:cs="Songti SC"/>
                 <w:b w:val="0"/>
                 <w:sz w:val="18"/>
               </w:rPr>
-              <w:t>v2.3 historical exploratory result candidate；对新 690T 目标已失效</w:t>
+              <w:t>v2.5 exploratory result candidate；含当前 VC709/690T direct 证据</w:t>
             </w:r>
           </w:p>
         </w:tc>
@@ -2839,7 +3068,7 @@
             <w:r/>
             <w:r>
               <w:rPr>
-                <w:rFonts w:ascii="FangSong_GB2312" w:hAnsi="FangSong_GB2312" w:eastAsia="FangSong_GB2312" w:cs="FangSong_GB2312"/>
+                <w:rFonts w:ascii="Songti SC" w:hAnsi="Songti SC" w:eastAsia="Songti SC" w:cs="Songti SC"/>
                 <w:b w:val="0"/>
                 <w:sz w:val="18"/>
               </w:rPr>
@@ -2865,7 +3094,7 @@
             <w:r/>
             <w:r>
               <w:rPr>
-                <w:rFonts w:ascii="FangSong_GB2312" w:hAnsi="FangSong_GB2312" w:eastAsia="FangSong_GB2312" w:cs="FangSong_GB2312"/>
+                <w:rFonts w:ascii="Songti SC" w:hAnsi="Songti SC" w:eastAsia="Songti SC" w:cs="Songti SC"/>
                 <w:b w:val="0"/>
                 <w:sz w:val="18"/>
               </w:rPr>
@@ -2891,7 +3120,7 @@
             <w:r/>
             <w:r>
               <w:rPr>
-                <w:rFonts w:ascii="FangSong_GB2312" w:hAnsi="FangSong_GB2312" w:eastAsia="FangSong_GB2312" w:cs="FangSong_GB2312"/>
+                <w:rFonts w:ascii="Songti SC" w:hAnsi="Songti SC" w:eastAsia="Songti SC" w:cs="Songti SC"/>
                 <w:b w:val="0"/>
                 <w:sz w:val="18"/>
               </w:rPr>
@@ -2919,7 +3148,7 @@
             <w:r/>
             <w:r>
               <w:rPr>
-                <w:rFonts w:ascii="FangSong_GB2312" w:hAnsi="FangSong_GB2312" w:eastAsia="FangSong_GB2312" w:cs="FangSong_GB2312"/>
+                <w:rFonts w:ascii="Songti SC" w:hAnsi="Songti SC" w:eastAsia="Songti SC" w:cs="Songti SC"/>
                 <w:b w:val="0"/>
                 <w:sz w:val="18"/>
               </w:rPr>
@@ -2945,7 +3174,7 @@
             <w:r/>
             <w:r>
               <w:rPr>
-                <w:rFonts w:ascii="FangSong_GB2312" w:hAnsi="FangSong_GB2312" w:eastAsia="FangSong_GB2312" w:cs="FangSong_GB2312"/>
+                <w:rFonts w:ascii="Songti SC" w:hAnsi="Songti SC" w:eastAsia="Songti SC" w:cs="Songti SC"/>
                 <w:b w:val="0"/>
                 <w:sz w:val="18"/>
               </w:rPr>
@@ -2971,7 +3200,7 @@
             <w:r/>
             <w:r>
               <w:rPr>
-                <w:rFonts w:ascii="FangSong_GB2312" w:hAnsi="FangSong_GB2312" w:eastAsia="FangSong_GB2312" w:cs="FangSong_GB2312"/>
+                <w:rFonts w:ascii="Songti SC" w:hAnsi="Songti SC" w:eastAsia="Songti SC" w:cs="Songti SC"/>
                 <w:b w:val="0"/>
                 <w:sz w:val="18"/>
               </w:rPr>
@@ -2999,7 +3228,7 @@
             <w:r/>
             <w:r>
               <w:rPr>
-                <w:rFonts w:ascii="FangSong_GB2312" w:hAnsi="FangSong_GB2312" w:eastAsia="FangSong_GB2312" w:cs="FangSong_GB2312"/>
+                <w:rFonts w:ascii="Songti SC" w:hAnsi="Songti SC" w:eastAsia="Songti SC" w:cs="Songti SC"/>
                 <w:b w:val="0"/>
                 <w:sz w:val="18"/>
               </w:rPr>
@@ -3025,7 +3254,7 @@
             <w:r/>
             <w:r>
               <w:rPr>
-                <w:rFonts w:ascii="FangSong_GB2312" w:hAnsi="FangSong_GB2312" w:eastAsia="FangSong_GB2312" w:cs="FangSong_GB2312"/>
+                <w:rFonts w:ascii="Songti SC" w:hAnsi="Songti SC" w:eastAsia="Songti SC" w:cs="Songti SC"/>
                 <w:b w:val="0"/>
                 <w:sz w:val="18"/>
               </w:rPr>
@@ -3051,11 +3280,11 @@
             <w:r/>
             <w:r>
               <w:rPr>
-                <w:rFonts w:ascii="FangSong_GB2312" w:hAnsi="FangSong_GB2312" w:eastAsia="FangSong_GB2312" w:cs="FangSong_GB2312"/>
+                <w:rFonts w:ascii="Songti SC" w:hAnsi="Songti SC" w:eastAsia="Songti SC" w:cs="Songti SC"/>
                 <w:b w:val="0"/>
                 <w:sz w:val="18"/>
               </w:rPr>
-              <w:t>v2.3 candidate；板级事实部分 blocked</w:t>
+              <w:t>v2.5 candidate；UG887/XTP213/Master XDC 交叉核对及修订后重跑已完成，实物板卡修订复核待办</w:t>
             </w:r>
           </w:p>
         </w:tc>
@@ -3079,7 +3308,7 @@
             <w:r/>
             <w:r>
               <w:rPr>
-                <w:rFonts w:ascii="FangSong_GB2312" w:hAnsi="FangSong_GB2312" w:eastAsia="FangSong_GB2312" w:cs="FangSong_GB2312"/>
+                <w:rFonts w:ascii="Songti SC" w:hAnsi="Songti SC" w:eastAsia="Songti SC" w:cs="Songti SC"/>
                 <w:b w:val="0"/>
                 <w:sz w:val="18"/>
               </w:rPr>
@@ -3105,7 +3334,7 @@
             <w:r/>
             <w:r>
               <w:rPr>
-                <w:rFonts w:ascii="FangSong_GB2312" w:hAnsi="FangSong_GB2312" w:eastAsia="FangSong_GB2312" w:cs="FangSong_GB2312"/>
+                <w:rFonts w:ascii="Songti SC" w:hAnsi="Songti SC" w:eastAsia="Songti SC" w:cs="Songti SC"/>
                 <w:b w:val="0"/>
                 <w:sz w:val="18"/>
               </w:rPr>
@@ -3131,11 +3360,11 @@
             <w:r/>
             <w:r>
               <w:rPr>
-                <w:rFonts w:ascii="FangSong_GB2312" w:hAnsi="FangSong_GB2312" w:eastAsia="FangSong_GB2312" w:cs="FangSong_GB2312"/>
+                <w:rFonts w:ascii="Songti SC" w:hAnsi="Songti SC" w:eastAsia="Songti SC" w:cs="Songti SC"/>
                 <w:b w:val="0"/>
                 <w:sz w:val="18"/>
               </w:rPr>
-              <w:t>v2.3 Word candidate；确认测试 blocked</w:t>
+              <w:t>v2.5 Word candidate；确认测试 blocked</w:t>
             </w:r>
           </w:p>
         </w:tc>
@@ -3159,7 +3388,7 @@
             <w:r/>
             <w:r>
               <w:rPr>
-                <w:rFonts w:ascii="FangSong_GB2312" w:hAnsi="FangSong_GB2312" w:eastAsia="FangSong_GB2312" w:cs="FangSong_GB2312"/>
+                <w:rFonts w:ascii="Songti SC" w:hAnsi="Songti SC" w:eastAsia="Songti SC" w:cs="Songti SC"/>
                 <w:b w:val="0"/>
                 <w:sz w:val="18"/>
               </w:rPr>
@@ -3185,7 +3414,7 @@
             <w:r/>
             <w:r>
               <w:rPr>
-                <w:rFonts w:ascii="FangSong_GB2312" w:hAnsi="FangSong_GB2312" w:eastAsia="FangSong_GB2312" w:cs="FangSong_GB2312"/>
+                <w:rFonts w:ascii="Songti SC" w:hAnsi="Songti SC" w:eastAsia="Songti SC" w:cs="Songti SC"/>
                 <w:b w:val="0"/>
                 <w:sz w:val="18"/>
               </w:rPr>
@@ -3211,11 +3440,11 @@
             <w:r/>
             <w:r>
               <w:rPr>
-                <w:rFonts w:ascii="FangSong_GB2312" w:hAnsi="FangSong_GB2312" w:eastAsia="FangSong_GB2312" w:cs="FangSong_GB2312"/>
+                <w:rFonts w:ascii="Songti SC" w:hAnsi="Songti SC" w:eastAsia="Songti SC" w:cs="Songti SC"/>
                 <w:b w:val="0"/>
                 <w:sz w:val="18"/>
               </w:rPr>
-              <w:t>v2.3 未执行/blocked report candidate，不宣称通过</w:t>
+              <w:t>v2.5 未执行/blocked report candidate，不宣称通过</w:t>
             </w:r>
           </w:p>
         </w:tc>
@@ -3239,7 +3468,7 @@
             <w:r/>
             <w:r>
               <w:rPr>
-                <w:rFonts w:ascii="FangSong_GB2312" w:hAnsi="FangSong_GB2312" w:eastAsia="FangSong_GB2312" w:cs="FangSong_GB2312"/>
+                <w:rFonts w:ascii="Songti SC" w:hAnsi="Songti SC" w:eastAsia="Songti SC" w:cs="Songti SC"/>
                 <w:b w:val="0"/>
                 <w:sz w:val="18"/>
               </w:rPr>
@@ -3265,7 +3494,7 @@
             <w:r/>
             <w:r>
               <w:rPr>
-                <w:rFonts w:ascii="FangSong_GB2312" w:hAnsi="FangSong_GB2312" w:eastAsia="FangSong_GB2312" w:cs="FangSong_GB2312"/>
+                <w:rFonts w:ascii="Songti SC" w:hAnsi="Songti SC" w:eastAsia="Songti SC" w:cs="Songti SC"/>
                 <w:b w:val="0"/>
                 <w:sz w:val="18"/>
               </w:rPr>
@@ -3291,11 +3520,11 @@
             <w:r/>
             <w:r>
               <w:rPr>
-                <w:rFonts w:ascii="FangSong_GB2312" w:hAnsi="FangSong_GB2312" w:eastAsia="FangSong_GB2312" w:cs="FangSong_GB2312"/>
+                <w:rFonts w:ascii="Songti SC" w:hAnsi="Songti SC" w:eastAsia="Songti SC" w:cs="Songti SC"/>
                 <w:b w:val="0"/>
                 <w:sz w:val="18"/>
               </w:rPr>
-              <w:t>v2.3 阶段/发布/报告候选；未建立产品基线或发布</w:t>
+              <w:t>v2.5 阶段/发布/报告候选；未建立产品基线或发布</w:t>
             </w:r>
           </w:p>
         </w:tc>
@@ -3312,7 +3541,7 @@
       </w:pPr>
       <w:r>
         <w:rPr>
-          <w:rFonts w:ascii="FangSong_GB2312" w:hAnsi="FangSong_GB2312" w:eastAsia="FangSong_GB2312" w:cs="FangSong_GB2312"/>
+          <w:rFonts w:ascii="Songti SC" w:hAnsi="Songti SC" w:eastAsia="Songti SC" w:cs="Songti SC"/>
           <w:b w:val="0"/>
           <w:sz w:val="22"/>
         </w:rPr>
@@ -3333,7 +3562,7 @@
       </w:pPr>
       <w:r>
         <w:rPr>
-          <w:rFonts w:ascii="FangSong_GB2312" w:hAnsi="FangSong_GB2312" w:eastAsia="FangSong_GB2312" w:cs="FangSong_GB2312"/>
+          <w:rFonts w:ascii="Songti SC" w:hAnsi="Songti SC" w:eastAsia="Songti SC" w:cs="Songti SC"/>
           <w:b w:val="0"/>
           <w:sz w:val="22"/>
         </w:rPr>
@@ -3378,7 +3607,7 @@
             <w:r/>
             <w:r>
               <w:rPr>
-                <w:rFonts w:ascii="FangSong_GB2312" w:hAnsi="FangSong_GB2312" w:eastAsia="FangSong_GB2312" w:cs="FangSong_GB2312"/>
+                <w:rFonts w:ascii="Songti SC" w:hAnsi="Songti SC" w:eastAsia="Songti SC" w:cs="Songti SC"/>
                 <w:b/>
                 <w:sz w:val="18"/>
               </w:rPr>
@@ -3405,7 +3634,7 @@
             <w:r/>
             <w:r>
               <w:rPr>
-                <w:rFonts w:ascii="FangSong_GB2312" w:hAnsi="FangSong_GB2312" w:eastAsia="FangSong_GB2312" w:cs="FangSong_GB2312"/>
+                <w:rFonts w:ascii="Songti SC" w:hAnsi="Songti SC" w:eastAsia="Songti SC" w:cs="Songti SC"/>
                 <w:b/>
                 <w:sz w:val="18"/>
               </w:rPr>
@@ -3432,7 +3661,7 @@
             <w:r/>
             <w:r>
               <w:rPr>
-                <w:rFonts w:ascii="FangSong_GB2312" w:hAnsi="FangSong_GB2312" w:eastAsia="FangSong_GB2312" w:cs="FangSong_GB2312"/>
+                <w:rFonts w:ascii="Songti SC" w:hAnsi="Songti SC" w:eastAsia="Songti SC" w:cs="Songti SC"/>
                 <w:b/>
                 <w:sz w:val="18"/>
               </w:rPr>
@@ -3459,7 +3688,7 @@
             <w:r/>
             <w:r>
               <w:rPr>
-                <w:rFonts w:ascii="FangSong_GB2312" w:hAnsi="FangSong_GB2312" w:eastAsia="FangSong_GB2312" w:cs="FangSong_GB2312"/>
+                <w:rFonts w:ascii="Songti SC" w:hAnsi="Songti SC" w:eastAsia="Songti SC" w:cs="Songti SC"/>
                 <w:b/>
                 <w:sz w:val="18"/>
               </w:rPr>
@@ -3486,7 +3715,7 @@
             <w:r/>
             <w:r>
               <w:rPr>
-                <w:rFonts w:ascii="FangSong_GB2312" w:hAnsi="FangSong_GB2312" w:eastAsia="FangSong_GB2312" w:cs="FangSong_GB2312"/>
+                <w:rFonts w:ascii="Songti SC" w:hAnsi="Songti SC" w:eastAsia="Songti SC" w:cs="Songti SC"/>
                 <w:b/>
                 <w:sz w:val="18"/>
               </w:rPr>
@@ -3514,7 +3743,7 @@
             <w:r/>
             <w:r>
               <w:rPr>
-                <w:rFonts w:ascii="FangSong_GB2312" w:hAnsi="FangSong_GB2312" w:eastAsia="FangSong_GB2312" w:cs="FangSong_GB2312"/>
+                <w:rFonts w:ascii="Songti SC" w:hAnsi="Songti SC" w:eastAsia="Songti SC" w:cs="Songti SC"/>
                 <w:b w:val="0"/>
                 <w:sz w:val="18"/>
               </w:rPr>
@@ -3540,7 +3769,7 @@
             <w:r/>
             <w:r>
               <w:rPr>
-                <w:rFonts w:ascii="FangSong_GB2312" w:hAnsi="FangSong_GB2312" w:eastAsia="FangSong_GB2312" w:cs="FangSong_GB2312"/>
+                <w:rFonts w:ascii="Songti SC" w:hAnsi="Songti SC" w:eastAsia="Songti SC" w:cs="Songti SC"/>
                 <w:b w:val="0"/>
                 <w:sz w:val="18"/>
               </w:rPr>
@@ -3566,7 +3795,7 @@
             <w:r/>
             <w:r>
               <w:rPr>
-                <w:rFonts w:ascii="FangSong_GB2312" w:hAnsi="FangSong_GB2312" w:eastAsia="FangSong_GB2312" w:cs="FangSong_GB2312"/>
+                <w:rFonts w:ascii="Songti SC" w:hAnsi="Songti SC" w:eastAsia="Songti SC" w:cs="Songti SC"/>
                 <w:b w:val="0"/>
                 <w:sz w:val="18"/>
               </w:rPr>
@@ -3592,7 +3821,7 @@
             <w:r/>
             <w:r>
               <w:rPr>
-                <w:rFonts w:ascii="FangSong_GB2312" w:hAnsi="FangSong_GB2312" w:eastAsia="FangSong_GB2312" w:cs="FangSong_GB2312"/>
+                <w:rFonts w:ascii="Songti SC" w:hAnsi="Songti SC" w:eastAsia="Songti SC" w:cs="Songti SC"/>
                 <w:b w:val="0"/>
                 <w:sz w:val="18"/>
               </w:rPr>
@@ -3618,7 +3847,7 @@
             <w:r/>
             <w:r>
               <w:rPr>
-                <w:rFonts w:ascii="FangSong_GB2312" w:hAnsi="FangSong_GB2312" w:eastAsia="FangSong_GB2312" w:cs="FangSong_GB2312"/>
+                <w:rFonts w:ascii="Songti SC" w:hAnsi="Songti SC" w:eastAsia="Songti SC" w:cs="Songti SC"/>
                 <w:b w:val="0"/>
                 <w:sz w:val="18"/>
               </w:rPr>
@@ -3646,7 +3875,7 @@
             <w:r/>
             <w:r>
               <w:rPr>
-                <w:rFonts w:ascii="FangSong_GB2312" w:hAnsi="FangSong_GB2312" w:eastAsia="FangSong_GB2312" w:cs="FangSong_GB2312"/>
+                <w:rFonts w:ascii="Songti SC" w:hAnsi="Songti SC" w:eastAsia="Songti SC" w:cs="Songti SC"/>
                 <w:b w:val="0"/>
                 <w:sz w:val="18"/>
               </w:rPr>
@@ -3672,7 +3901,7 @@
             <w:r/>
             <w:r>
               <w:rPr>
-                <w:rFonts w:ascii="FangSong_GB2312" w:hAnsi="FangSong_GB2312" w:eastAsia="FangSong_GB2312" w:cs="FangSong_GB2312"/>
+                <w:rFonts w:ascii="Songti SC" w:hAnsi="Songti SC" w:eastAsia="Songti SC" w:cs="Songti SC"/>
                 <w:b w:val="0"/>
                 <w:sz w:val="18"/>
               </w:rPr>
@@ -3698,7 +3927,7 @@
             <w:r/>
             <w:r>
               <w:rPr>
-                <w:rFonts w:ascii="FangSong_GB2312" w:hAnsi="FangSong_GB2312" w:eastAsia="FangSong_GB2312" w:cs="FangSong_GB2312"/>
+                <w:rFonts w:ascii="Songti SC" w:hAnsi="Songti SC" w:eastAsia="Songti SC" w:cs="Songti SC"/>
                 <w:b w:val="0"/>
                 <w:sz w:val="18"/>
               </w:rPr>
@@ -3724,11 +3953,11 @@
             <w:r/>
             <w:r>
               <w:rPr>
-                <w:rFonts w:ascii="FangSong_GB2312" w:hAnsi="FangSong_GB2312" w:eastAsia="FangSong_GB2312" w:cs="FangSong_GB2312"/>
+                <w:rFonts w:ascii="Songti SC" w:hAnsi="Songti SC" w:eastAsia="Songti SC" w:cs="Songti SC"/>
                 <w:b w:val="0"/>
                 <w:sz w:val="18"/>
               </w:rPr>
-              <w:t>文档结构可供审查，但无板卡、管脚、电气、仪器和批准输入，不能形成可执行实物测试或通过报告</w:t>
+              <w:t>板卡候选事实和预码流证据已具备，但无已批 bitstream、实物板卡、仪器和批准输入，不能形成可执行实物测试或通过报告</w:t>
             </w:r>
           </w:p>
         </w:tc>
@@ -3750,7 +3979,7 @@
             <w:r/>
             <w:r>
               <w:rPr>
-                <w:rFonts w:ascii="FangSong_GB2312" w:hAnsi="FangSong_GB2312" w:eastAsia="FangSong_GB2312" w:cs="FangSong_GB2312"/>
+                <w:rFonts w:ascii="Songti SC" w:hAnsi="Songti SC" w:eastAsia="Songti SC" w:cs="Songti SC"/>
                 <w:b w:val="0"/>
                 <w:sz w:val="18"/>
               </w:rPr>
@@ -3778,7 +4007,7 @@
             <w:r/>
             <w:r>
               <w:rPr>
-                <w:rFonts w:ascii="FangSong_GB2312" w:hAnsi="FangSong_GB2312" w:eastAsia="FangSong_GB2312" w:cs="FangSong_GB2312"/>
+                <w:rFonts w:ascii="Songti SC" w:hAnsi="Songti SC" w:eastAsia="Songti SC" w:cs="Songti SC"/>
                 <w:b w:val="0"/>
                 <w:sz w:val="18"/>
               </w:rPr>
@@ -3804,7 +4033,7 @@
             <w:r/>
             <w:r>
               <w:rPr>
-                <w:rFonts w:ascii="FangSong_GB2312" w:hAnsi="FangSong_GB2312" w:eastAsia="FangSong_GB2312" w:cs="FangSong_GB2312"/>
+                <w:rFonts w:ascii="Songti SC" w:hAnsi="Songti SC" w:eastAsia="Songti SC" w:cs="Songti SC"/>
                 <w:b w:val="0"/>
                 <w:sz w:val="18"/>
               </w:rPr>
@@ -3830,7 +4059,7 @@
             <w:r/>
             <w:r>
               <w:rPr>
-                <w:rFonts w:ascii="FangSong_GB2312" w:hAnsi="FangSong_GB2312" w:eastAsia="FangSong_GB2312" w:cs="FangSong_GB2312"/>
+                <w:rFonts w:ascii="Songti SC" w:hAnsi="Songti SC" w:eastAsia="Songti SC" w:cs="Songti SC"/>
                 <w:b w:val="0"/>
                 <w:sz w:val="18"/>
               </w:rPr>
@@ -3856,7 +4085,7 @@
             <w:r/>
             <w:r>
               <w:rPr>
-                <w:rFonts w:ascii="FangSong_GB2312" w:hAnsi="FangSong_GB2312" w:eastAsia="FangSong_GB2312" w:cs="FangSong_GB2312"/>
+                <w:rFonts w:ascii="Songti SC" w:hAnsi="Songti SC" w:eastAsia="Songti SC" w:cs="Songti SC"/>
                 <w:b w:val="0"/>
                 <w:sz w:val="18"/>
               </w:rPr>
@@ -3882,7 +4111,7 @@
             <w:r/>
             <w:r>
               <w:rPr>
-                <w:rFonts w:ascii="FangSong_GB2312" w:hAnsi="FangSong_GB2312" w:eastAsia="FangSong_GB2312" w:cs="FangSong_GB2312"/>
+                <w:rFonts w:ascii="Songti SC" w:hAnsi="Songti SC" w:eastAsia="Songti SC" w:cs="Songti SC"/>
                 <w:b w:val="0"/>
                 <w:sz w:val="18"/>
               </w:rPr>
@@ -3910,7 +4139,7 @@
             <w:r/>
             <w:r>
               <w:rPr>
-                <w:rFonts w:ascii="FangSong_GB2312" w:hAnsi="FangSong_GB2312" w:eastAsia="FangSong_GB2312" w:cs="FangSong_GB2312"/>
+                <w:rFonts w:ascii="Songti SC" w:hAnsi="Songti SC" w:eastAsia="Songti SC" w:cs="Songti SC"/>
                 <w:b w:val="0"/>
                 <w:sz w:val="18"/>
               </w:rPr>
@@ -3936,7 +4165,7 @@
             <w:r/>
             <w:r>
               <w:rPr>
-                <w:rFonts w:ascii="FangSong_GB2312" w:hAnsi="FangSong_GB2312" w:eastAsia="FangSong_GB2312" w:cs="FangSong_GB2312"/>
+                <w:rFonts w:ascii="Songti SC" w:hAnsi="Songti SC" w:eastAsia="Songti SC" w:cs="Songti SC"/>
                 <w:b w:val="0"/>
                 <w:sz w:val="18"/>
               </w:rPr>
@@ -3962,7 +4191,7 @@
             <w:r/>
             <w:r>
               <w:rPr>
-                <w:rFonts w:ascii="FangSong_GB2312" w:hAnsi="FangSong_GB2312" w:eastAsia="FangSong_GB2312" w:cs="FangSong_GB2312"/>
+                <w:rFonts w:ascii="Songti SC" w:hAnsi="Songti SC" w:eastAsia="Songti SC" w:cs="Songti SC"/>
                 <w:b w:val="0"/>
                 <w:sz w:val="18"/>
               </w:rPr>
@@ -3988,7 +4217,7 @@
             <w:r/>
             <w:r>
               <w:rPr>
-                <w:rFonts w:ascii="FangSong_GB2312" w:hAnsi="FangSong_GB2312" w:eastAsia="FangSong_GB2312" w:cs="FangSong_GB2312"/>
+                <w:rFonts w:ascii="Songti SC" w:hAnsi="Songti SC" w:eastAsia="Songti SC" w:cs="Songti SC"/>
                 <w:b w:val="0"/>
                 <w:sz w:val="18"/>
               </w:rPr>
@@ -4014,7 +4243,7 @@
             <w:r/>
             <w:r>
               <w:rPr>
-                <w:rFonts w:ascii="FangSong_GB2312" w:hAnsi="FangSong_GB2312" w:eastAsia="FangSong_GB2312" w:cs="FangSong_GB2312"/>
+                <w:rFonts w:ascii="Songti SC" w:hAnsi="Songti SC" w:eastAsia="Songti SC" w:cs="Songti SC"/>
                 <w:b w:val="0"/>
                 <w:sz w:val="18"/>
               </w:rPr>
@@ -4042,7 +4271,7 @@
             <w:r/>
             <w:r>
               <w:rPr>
-                <w:rFonts w:ascii="FangSong_GB2312" w:hAnsi="FangSong_GB2312" w:eastAsia="FangSong_GB2312" w:cs="FangSong_GB2312"/>
+                <w:rFonts w:ascii="Songti SC" w:hAnsi="Songti SC" w:eastAsia="Songti SC" w:cs="Songti SC"/>
                 <w:b w:val="0"/>
                 <w:sz w:val="18"/>
               </w:rPr>
@@ -4068,7 +4297,7 @@
             <w:r/>
             <w:r>
               <w:rPr>
-                <w:rFonts w:ascii="FangSong_GB2312" w:hAnsi="FangSong_GB2312" w:eastAsia="FangSong_GB2312" w:cs="FangSong_GB2312"/>
+                <w:rFonts w:ascii="Songti SC" w:hAnsi="Songti SC" w:eastAsia="Songti SC" w:cs="Songti SC"/>
                 <w:b w:val="0"/>
                 <w:sz w:val="18"/>
               </w:rPr>
@@ -4094,7 +4323,7 @@
             <w:r/>
             <w:r>
               <w:rPr>
-                <w:rFonts w:ascii="FangSong_GB2312" w:hAnsi="FangSong_GB2312" w:eastAsia="FangSong_GB2312" w:cs="FangSong_GB2312"/>
+                <w:rFonts w:ascii="Songti SC" w:hAnsi="Songti SC" w:eastAsia="Songti SC" w:cs="Songti SC"/>
                 <w:b w:val="0"/>
                 <w:sz w:val="18"/>
               </w:rPr>
@@ -4120,7 +4349,7 @@
             <w:r/>
             <w:r>
               <w:rPr>
-                <w:rFonts w:ascii="FangSong_GB2312" w:hAnsi="FangSong_GB2312" w:eastAsia="FangSong_GB2312" w:cs="FangSong_GB2312"/>
+                <w:rFonts w:ascii="Songti SC" w:hAnsi="Songti SC" w:eastAsia="Songti SC" w:cs="Songti SC"/>
                 <w:b w:val="0"/>
                 <w:sz w:val="18"/>
               </w:rPr>
@@ -4146,7 +4375,7 @@
             <w:r/>
             <w:r>
               <w:rPr>
-                <w:rFonts w:ascii="FangSong_GB2312" w:hAnsi="FangSong_GB2312" w:eastAsia="FangSong_GB2312" w:cs="FangSong_GB2312"/>
+                <w:rFonts w:ascii="Songti SC" w:hAnsi="Songti SC" w:eastAsia="Songti SC" w:cs="Songti SC"/>
                 <w:b w:val="0"/>
                 <w:sz w:val="18"/>
               </w:rPr>
@@ -4174,7 +4403,7 @@
             <w:r/>
             <w:r>
               <w:rPr>
-                <w:rFonts w:ascii="FangSong_GB2312" w:hAnsi="FangSong_GB2312" w:eastAsia="FangSong_GB2312" w:cs="FangSong_GB2312"/>
+                <w:rFonts w:ascii="Songti SC" w:hAnsi="Songti SC" w:eastAsia="Songti SC" w:cs="Songti SC"/>
                 <w:b w:val="0"/>
                 <w:sz w:val="18"/>
               </w:rPr>
@@ -4200,7 +4429,7 @@
             <w:r/>
             <w:r>
               <w:rPr>
-                <w:rFonts w:ascii="FangSong_GB2312" w:hAnsi="FangSong_GB2312" w:eastAsia="FangSong_GB2312" w:cs="FangSong_GB2312"/>
+                <w:rFonts w:ascii="Songti SC" w:hAnsi="Songti SC" w:eastAsia="Songti SC" w:cs="Songti SC"/>
                 <w:b w:val="0"/>
                 <w:sz w:val="18"/>
               </w:rPr>
@@ -4226,7 +4455,7 @@
             <w:r/>
             <w:r>
               <w:rPr>
-                <w:rFonts w:ascii="FangSong_GB2312" w:hAnsi="FangSong_GB2312" w:eastAsia="FangSong_GB2312" w:cs="FangSong_GB2312"/>
+                <w:rFonts w:ascii="Songti SC" w:hAnsi="Songti SC" w:eastAsia="Songti SC" w:cs="Songti SC"/>
                 <w:b w:val="0"/>
                 <w:sz w:val="18"/>
               </w:rPr>
@@ -4252,11 +4481,11 @@
             <w:r/>
             <w:r>
               <w:rPr>
-                <w:rFonts w:ascii="FangSong_GB2312" w:hAnsi="FangSong_GB2312" w:eastAsia="FangSong_GB2312" w:cs="FangSong_GB2312"/>
+                <w:rFonts w:ascii="Songti SC" w:hAnsi="Songti SC" w:eastAsia="Songti SC" w:cs="Songti SC"/>
                 <w:b w:val="0"/>
                 <w:sz w:val="18"/>
               </w:rPr>
-              <w:t>缺板级事实和仪器；行为仿真不能替代实物确认</w:t>
+              <w:t>XTP213/Master XDC 交叉核对已完成，但实物板卡修订确认、仪器和已批 bitstream 缺失；行为仿真不能替代实物确认</w:t>
             </w:r>
           </w:p>
         </w:tc>
@@ -4278,7 +4507,7 @@
             <w:r/>
             <w:r>
               <w:rPr>
-                <w:rFonts w:ascii="FangSong_GB2312" w:hAnsi="FangSong_GB2312" w:eastAsia="FangSong_GB2312" w:cs="FangSong_GB2312"/>
+                <w:rFonts w:ascii="Songti SC" w:hAnsi="Songti SC" w:eastAsia="Songti SC" w:cs="Songti SC"/>
                 <w:b w:val="0"/>
                 <w:sz w:val="18"/>
               </w:rPr>
@@ -4299,7 +4528,7 @@
       </w:pPr>
       <w:r>
         <w:rPr>
-          <w:rFonts w:ascii="FangSong_GB2312" w:hAnsi="FangSong_GB2312" w:eastAsia="FangSong_GB2312" w:cs="FangSong_GB2312"/>
+          <w:rFonts w:ascii="Songti SC" w:hAnsi="Songti SC" w:eastAsia="Songti SC" w:cs="Songti SC"/>
           <w:b w:val="0"/>
           <w:sz w:val="22"/>
         </w:rPr>
@@ -4324,7 +4553,7 @@
       </w:pPr>
       <w:r>
         <w:rPr>
-          <w:rFonts w:ascii="FangSong_GB2312" w:hAnsi="FangSong_GB2312" w:eastAsia="FangSong_GB2312" w:cs="FangSong_GB2312"/>
+          <w:rFonts w:ascii="Songti SC" w:hAnsi="Songti SC" w:eastAsia="Songti SC" w:cs="Songti SC"/>
           <w:b w:val="0"/>
           <w:sz w:val="22"/>
         </w:rPr>
@@ -4341,7 +4570,7 @@
       </w:pPr>
       <w:r>
         <w:rPr>
-          <w:rFonts w:ascii="FangSong_GB2312" w:hAnsi="FangSong_GB2312" w:eastAsia="FangSong_GB2312" w:cs="FangSong_GB2312"/>
+          <w:rFonts w:ascii="Songti SC" w:hAnsi="Songti SC" w:eastAsia="Songti SC" w:cs="Songti SC"/>
           <w:b w:val="0"/>
           <w:sz w:val="22"/>
         </w:rPr>
@@ -4358,7 +4587,7 @@
       </w:pPr>
       <w:r>
         <w:rPr>
-          <w:rFonts w:ascii="FangSong_GB2312" w:hAnsi="FangSong_GB2312" w:eastAsia="FangSong_GB2312" w:cs="FangSong_GB2312"/>
+          <w:rFonts w:ascii="Songti SC" w:hAnsi="Songti SC" w:eastAsia="Songti SC" w:cs="Songti SC"/>
           <w:b w:val="0"/>
           <w:sz w:val="22"/>
         </w:rPr>
@@ -4375,7 +4604,7 @@
       </w:pPr>
       <w:r>
         <w:rPr>
-          <w:rFonts w:ascii="FangSong_GB2312" w:hAnsi="FangSong_GB2312" w:eastAsia="FangSong_GB2312" w:cs="FangSong_GB2312"/>
+          <w:rFonts w:ascii="Songti SC" w:hAnsi="Songti SC" w:eastAsia="Songti SC" w:cs="Songti SC"/>
           <w:b w:val="0"/>
           <w:sz w:val="22"/>
         </w:rPr>
@@ -4392,11 +4621,45 @@
       </w:pPr>
       <w:r>
         <w:rPr>
-          <w:rFonts w:ascii="FangSong_GB2312" w:hAnsi="FangSong_GB2312" w:eastAsia="FangSong_GB2312" w:cs="FangSong_GB2312"/>
+          <w:rFonts w:ascii="Songti SC" w:hAnsi="Songti SC" w:eastAsia="Songti SC" w:cs="Songti SC"/>
           <w:b w:val="0"/>
           <w:sz w:val="22"/>
         </w:rPr>
-        <w:t>RTL/TB/XDC 变化使旧仿真、综合、实现和码流证据不再支持新候选；</w:t>
+        <w:t xml:space="preserve">RTL/TB/XDC 变化使旧仿真、综合和实现证据不再支持新候选；当前证据索引为 </w:t>
+      </w:r>
+      <w:r>
+        <w:rPr>
+          <w:rFonts w:ascii="Courier New" w:hAnsi="Courier New" w:eastAsia="Courier New" w:cs="Courier New"/>
+          <w:b w:val="0"/>
+          <w:color w:val="1F3A5F"/>
+          <w:sz w:val="21"/>
+        </w:rPr>
+        <w:t>evidence/vc709-prebit-20260828-diff-sstl15/</w:t>
+      </w:r>
+      <w:r>
+        <w:rPr>
+          <w:rFonts w:ascii="Songti SC" w:hAnsi="Songti SC" w:eastAsia="Songti SC" w:cs="Songti SC"/>
+          <w:b w:val="0"/>
+          <w:sz w:val="22"/>
+        </w:rPr>
+        <w:t>，其中冻结 Mac→66 direct transport/effective-config；</w:t>
+      </w:r>
+      <w:r>
+        <w:rPr>
+          <w:rFonts w:ascii="Courier New" w:hAnsi="Courier New" w:eastAsia="Courier New" w:cs="Courier New"/>
+          <w:b w:val="0"/>
+          <w:color w:val="1F3A5F"/>
+          <w:sz w:val="21"/>
+        </w:rPr>
+        <w:t>vc709-prebit-20260827/</w:t>
+      </w:r>
+      <w:r>
+        <w:rPr>
+          <w:rFonts w:ascii="Songti SC" w:hAnsi="Songti SC" w:eastAsia="Songti SC" w:cs="Songti SC"/>
+          <w:b w:val="0"/>
+          <w:sz w:val="22"/>
+        </w:rPr>
+        <w:t xml:space="preserve"> 只作修订前历史记录；</w:t>
       </w:r>
     </w:p>
     <w:p>
@@ -4409,11 +4672,20 @@
       </w:pPr>
       <w:r>
         <w:rPr>
-          <w:rFonts w:ascii="FangSong_GB2312" w:hAnsi="FangSong_GB2312" w:eastAsia="FangSong_GB2312" w:cs="FangSong_GB2312"/>
+          <w:rFonts w:ascii="Courier New" w:hAnsi="Courier New" w:eastAsia="Courier New" w:cs="Courier New"/>
+          <w:b w:val="0"/>
+          <w:color w:val="1F3A5F"/>
+          <w:sz w:val="21"/>
+        </w:rPr>
+        <w:t>stopBeforeBitstream=true</w:t>
+      </w:r>
+      <w:r>
+        <w:rPr>
+          <w:rFonts w:ascii="Songti SC" w:hAnsi="Songti SC" w:eastAsia="Songti SC" w:cs="Songti SC"/>
           <w:b w:val="0"/>
           <w:sz w:val="22"/>
         </w:rPr>
-        <w:t xml:space="preserve">正式 </w:t>
+        <w:t xml:space="preserve"> 时必须完成报告/DCP 且不调用 </w:t>
       </w:r>
       <w:r>
         <w:rPr>
@@ -4422,15 +4694,32 @@
           <w:color w:val="1F3A5F"/>
           <w:sz w:val="21"/>
         </w:rPr>
-        <w:t>uart.xdc</w:t>
+        <w:t>write_bitstream</w:t>
       </w:r>
       <w:r>
         <w:rPr>
-          <w:rFonts w:ascii="FangSong_GB2312" w:hAnsi="FangSong_GB2312" w:eastAsia="FangSong_GB2312" w:cs="FangSong_GB2312"/>
+          <w:rFonts w:ascii="Songti SC" w:hAnsi="Songti SC" w:eastAsia="Songti SC" w:cs="Songti SC"/>
           <w:b w:val="0"/>
           <w:sz w:val="22"/>
         </w:rPr>
-        <w:t xml:space="preserve"> 缺 LOC/IOSTANDARD 等板级事实时必须 fail-closed；</w:t>
+        <w:t xml:space="preserve">；任何意外 </w:t>
+      </w:r>
+      <w:r>
+        <w:rPr>
+          <w:rFonts w:ascii="Courier New" w:hAnsi="Courier New" w:eastAsia="Courier New" w:cs="Courier New"/>
+          <w:b w:val="0"/>
+          <w:color w:val="1F3A5F"/>
+          <w:sz w:val="21"/>
+        </w:rPr>
+        <w:t>.bit</w:t>
+      </w:r>
+      <w:r>
+        <w:rPr>
+          <w:rFonts w:ascii="Songti SC" w:hAnsi="Songti SC" w:eastAsia="Songti SC" w:cs="Songti SC"/>
+          <w:b w:val="0"/>
+          <w:sz w:val="22"/>
+        </w:rPr>
+        <w:t xml:space="preserve"> 都判失败并清理；</w:t>
       </w:r>
     </w:p>
     <w:p>
@@ -4443,7 +4732,7 @@
       </w:pPr>
       <w:r>
         <w:rPr>
-          <w:rFonts w:ascii="FangSong_GB2312" w:hAnsi="FangSong_GB2312" w:eastAsia="FangSong_GB2312" w:cs="FangSong_GB2312"/>
+          <w:rFonts w:ascii="Songti SC" w:hAnsi="Songti SC" w:eastAsia="Songti SC" w:cs="Songti SC"/>
           <w:b w:val="0"/>
           <w:sz w:val="22"/>
         </w:rPr>
@@ -4464,11 +4753,28 @@
       </w:pPr>
       <w:r>
         <w:rPr>
-          <w:rFonts w:ascii="FangSong_GB2312" w:hAnsi="FangSong_GB2312" w:eastAsia="FangSong_GB2312" w:cs="FangSong_GB2312"/>
+          <w:rFonts w:ascii="Songti SC" w:hAnsi="Songti SC" w:eastAsia="Songti SC" w:cs="Songti SC"/>
           <w:b w:val="0"/>
           <w:sz w:val="22"/>
         </w:rPr>
-        <w:t>当前对象只能描述为“v2.3 文档与技术整改候选”。G1～G4 的正式入口、独立检查和授权批准尚未完成，无 B0/B1/B2；旧 worker-66/K70T exploratory 仿真、综合和 STA 证据不能支持当前 690T 目标的器件级结论。</w:t>
+        <w:t xml:space="preserve">当前对象只能描述为“v2.5 文档与技术验证候选”。真实 Connector 已通过冻结的 Mac→66 直连完成全新 job 身份的精确 690T part 查询、源码校验、9600/115200 XSim、综合，以及修订后 </w:t>
+      </w:r>
+      <w:r>
+        <w:rPr>
+          <w:rFonts w:ascii="Courier New" w:hAnsi="Courier New" w:eastAsia="Courier New" w:cs="Courier New"/>
+          <w:b w:val="0"/>
+          <w:color w:val="1F3A5F"/>
+          <w:sz w:val="21"/>
+        </w:rPr>
+        <w:t>DIFF_SSTL15</w:t>
+      </w:r>
+      <w:r>
+        <w:rPr>
+          <w:rFonts w:ascii="Songti SC" w:hAnsi="Songti SC" w:eastAsia="Songti SC" w:cs="Songti SC"/>
+          <w:b w:val="0"/>
+          <w:sz w:val="22"/>
+        </w:rPr>
+        <w:t xml:space="preserve"> 的布局布线、methodology、CDC、DRC、STA 和资源报告，且未生成 bitstream；G1～G4 的正式入口、覆盖、独立检查、授权批准和实物确认仍未完成，无 B0/B1/B2。</w:t>
       </w:r>
     </w:p>
     <w:p>
@@ -4485,7 +4791,7 @@
       </w:pPr>
       <w:r>
         <w:rPr>
-          <w:rFonts w:ascii="FangSong_GB2312" w:hAnsi="FangSong_GB2312" w:eastAsia="FangSong_GB2312" w:cs="FangSong_GB2312"/>
+          <w:rFonts w:ascii="Songti SC" w:hAnsi="Songti SC" w:eastAsia="Songti SC" w:cs="Songti SC"/>
           <w:b w:val="0"/>
           <w:sz w:val="22"/>
         </w:rPr>
@@ -4513,7 +4819,7 @@
     </w:pPr>
     <w:r>
       <w:rPr>
-        <w:rFonts w:ascii="FangSong_GB2312" w:hAnsi="FangSong_GB2312" w:eastAsia="FangSong_GB2312" w:cs="FangSong_GB2312"/>
+        <w:rFonts w:ascii="Songti SC" w:hAnsi="Songti SC" w:eastAsia="Songti SC" w:cs="Songti SC"/>
         <w:color w:val="666666"/>
         <w:sz w:val="18"/>
       </w:rPr>
@@ -4524,7 +4830,7 @@
     </w:r>
     <w:r>
       <w:rPr>
-        <w:rFonts w:ascii="FangSong_GB2312" w:hAnsi="FangSong_GB2312" w:eastAsia="FangSong_GB2312" w:cs="FangSong_GB2312"/>
+        <w:rFonts w:ascii="Songti SC" w:hAnsi="Songti SC" w:eastAsia="Songti SC" w:cs="Songti SC"/>
         <w:color w:val="666666"/>
         <w:sz w:val="18"/>
       </w:rPr>
@@ -4543,7 +4849,7 @@
     </w:pPr>
     <w:r>
       <w:rPr>
-        <w:rFonts w:ascii="FangSong_GB2312" w:hAnsi="FangSong_GB2312" w:eastAsia="FangSong_GB2312" w:cs="FangSong_GB2312"/>
+        <w:rFonts w:ascii="Songti SC" w:hAnsi="Songti SC" w:eastAsia="Songti SC" w:cs="Songti SC"/>
         <w:color w:val="666666"/>
         <w:sz w:val="17"/>
       </w:rPr>
@@ -4958,7 +5264,7 @@
       <w:spacing w:before="0" w:after="120" w:line="300" w:lineRule="auto"/>
     </w:pPr>
     <w:rPr>
-      <w:rFonts w:ascii="FangSong_GB2312" w:hAnsi="FangSong_GB2312" w:eastAsia="FangSong_GB2312" w:cs="FangSong_GB2312"/>
+      <w:rFonts w:ascii="Songti SC" w:hAnsi="Songti SC" w:eastAsia="Songti SC" w:cs="Songti SC"/>
       <w:sz w:val="22"/>
     </w:rPr>
   </w:style>
@@ -5021,7 +5327,7 @@
       <w:outlineLvl w:val="0"/>
     </w:pPr>
     <w:rPr>
-      <w:rFonts w:asciiTheme="majorHAnsi" w:eastAsiaTheme="majorEastAsia" w:hAnsiTheme="majorHAnsi" w:cstheme="majorBidi" w:ascii="FangSong_GB2312" w:hAnsi="FangSong_GB2312" w:eastAsia="FangSong_GB2312" w:cs="FangSong_GB2312"/>
+      <w:rFonts w:asciiTheme="majorHAnsi" w:eastAsiaTheme="majorEastAsia" w:hAnsiTheme="majorHAnsi" w:cstheme="majorBidi" w:ascii="Songti SC" w:hAnsi="Songti SC" w:eastAsia="Songti SC" w:cs="Songti SC"/>
       <w:b/>
       <w:bCs/>
       <w:color w:val="2E74B5"/>
@@ -5045,7 +5351,7 @@
       <w:outlineLvl w:val="1"/>
     </w:pPr>
     <w:rPr>
-      <w:rFonts w:asciiTheme="majorHAnsi" w:eastAsiaTheme="majorEastAsia" w:hAnsiTheme="majorHAnsi" w:cstheme="majorBidi" w:ascii="FangSong_GB2312" w:hAnsi="FangSong_GB2312" w:eastAsia="FangSong_GB2312" w:cs="FangSong_GB2312"/>
+      <w:rFonts w:asciiTheme="majorHAnsi" w:eastAsiaTheme="majorEastAsia" w:hAnsiTheme="majorHAnsi" w:cstheme="majorBidi" w:ascii="Songti SC" w:hAnsi="Songti SC" w:eastAsia="Songti SC" w:cs="Songti SC"/>
       <w:b/>
       <w:bCs/>
       <w:color w:val="2E74B5"/>
@@ -5069,7 +5375,7 @@
       <w:outlineLvl w:val="2"/>
     </w:pPr>
     <w:rPr>
-      <w:rFonts w:asciiTheme="majorHAnsi" w:eastAsiaTheme="majorEastAsia" w:hAnsiTheme="majorHAnsi" w:cstheme="majorBidi" w:ascii="FangSong_GB2312" w:hAnsi="FangSong_GB2312" w:eastAsia="FangSong_GB2312" w:cs="FangSong_GB2312"/>
+      <w:rFonts w:asciiTheme="majorHAnsi" w:eastAsiaTheme="majorEastAsia" w:hAnsiTheme="majorHAnsi" w:cstheme="majorBidi" w:ascii="Songti SC" w:hAnsi="Songti SC" w:eastAsia="Songti SC" w:cs="Songti SC"/>
       <w:b/>
       <w:bCs/>
       <w:color w:val="1F4D78"/>
@@ -5313,7 +5619,7 @@
       <w:jc w:val="center"/>
     </w:pPr>
     <w:rPr>
-      <w:rFonts w:asciiTheme="majorHAnsi" w:eastAsiaTheme="majorEastAsia" w:hAnsiTheme="majorHAnsi" w:cstheme="majorBidi" w:ascii="FangSong_GB2312" w:hAnsi="FangSong_GB2312" w:eastAsia="FangSong_GB2312" w:cs="FangSong_GB2312"/>
+      <w:rFonts w:asciiTheme="majorHAnsi" w:eastAsiaTheme="majorEastAsia" w:hAnsiTheme="majorHAnsi" w:cstheme="majorBidi" w:ascii="Songti SC" w:hAnsi="Songti SC" w:eastAsia="Songti SC" w:cs="Songti SC"/>
       <w:b w:val="0"/>
       <w:color w:val="000000"/>
       <w:spacing w:val="5"/>
@@ -5497,7 +5803,7 @@
       <w:contextualSpacing/>
     </w:pPr>
     <w:rPr>
-      <w:rFonts w:ascii="FangSong_GB2312" w:hAnsi="FangSong_GB2312" w:eastAsia="FangSong_GB2312" w:cs="FangSong_GB2312"/>
+      <w:rFonts w:ascii="Songti SC" w:hAnsi="Songti SC" w:eastAsia="Songti SC" w:cs="Songti SC"/>
       <w:sz w:val="22"/>
     </w:rPr>
   </w:style>
@@ -5542,7 +5848,7 @@
       <w:contextualSpacing/>
     </w:pPr>
     <w:rPr>
-      <w:rFonts w:ascii="FangSong_GB2312" w:hAnsi="FangSong_GB2312" w:eastAsia="FangSong_GB2312" w:cs="FangSong_GB2312"/>
+      <w:rFonts w:ascii="Songti SC" w:hAnsi="Songti SC" w:eastAsia="Songti SC" w:cs="Songti SC"/>
       <w:sz w:val="22"/>
     </w:rPr>
   </w:style>

</xml_diff>